<commit_message>
Cambios pedidos por la organización
- Sede: Facultad de Educación, edificios Cossío y Solís, sin espacios
- Programa en lista con la sala en cada actividad y enlace al mapa
- Comités: consorcio y equipo organizador, dos personas más
- Ejes numerados, sin Trayectoria y sin contacto general
- Cuatro talleres y plantilla de texto completo nueva
</commit_message>
<xml_diff>
--- a/public/descargas/ieTIC2027_Plantilla_texto_completo.docx
+++ b/public/descargas/ieTIC2027_Plantilla_texto_completo.docx
@@ -1,6 +1,6 @@
 
 <file path=word/document.xml><?xml version="1.0" encoding="utf-8"?>
-<w:document xmlns:wpc="http://schemas.microsoft.com/office/word/2010/wordprocessingCanvas" xmlns:cx="http://schemas.microsoft.com/office/drawing/2014/chartex" xmlns:cx1="http://schemas.microsoft.com/office/drawing/2015/9/8/chartex" xmlns:cx2="http://schemas.microsoft.com/office/drawing/2015/10/21/chartex" xmlns:cx3="http://schemas.microsoft.com/office/drawing/2016/5/9/chartex" xmlns:cx4="http://schemas.microsoft.com/office/drawing/2016/5/10/chartex" xmlns:cx5="http://schemas.microsoft.com/office/drawing/2016/5/11/chartex" xmlns:cx6="http://schemas.microsoft.com/office/drawing/2016/5/12/chartex" xmlns:cx7="http://schemas.microsoft.com/office/drawing/2016/5/13/chartex" xmlns:cx8="http://schemas.microsoft.com/office/drawing/2016/5/14/chartex" xmlns:mc="http://schemas.openxmlformats.org/markup-compatibility/2006" xmlns:aink="http://schemas.microsoft.com/office/drawing/2016/ink" xmlns:am3d="http://schemas.microsoft.com/office/drawing/2017/model3d" xmlns:o="urn:schemas-microsoft-com:office:office" xmlns:r="http://schemas.openxmlformats.org/officeDocument/2006/relationships" xmlns:m="http://schemas.openxmlformats.org/officeDocument/2006/math" xmlns:v="urn:schemas-microsoft-com:vml" xmlns:wp14="http://schemas.microsoft.com/office/word/2010/wordprocessingDrawing" xmlns:wp="http://schemas.openxmlformats.org/drawingml/2006/wordprocessingDrawing" xmlns:w10="urn:schemas-microsoft-com:office:word" xmlns:w="http://schemas.openxmlformats.org/wordprocessingml/2006/main" xmlns:w14="http://schemas.microsoft.com/office/word/2010/wordml" xmlns:w15="http://schemas.microsoft.com/office/word/2012/wordml" xmlns:w16cid="http://schemas.microsoft.com/office/word/2016/wordml/cid" xmlns:w16se="http://schemas.microsoft.com/office/word/2015/wordml/symex" xmlns:wpg="http://schemas.microsoft.com/office/word/2010/wordprocessingGroup" xmlns:wpi="http://schemas.microsoft.com/office/word/2010/wordprocessingInk" xmlns:wne="http://schemas.microsoft.com/office/word/2006/wordml" xmlns:wps="http://schemas.microsoft.com/office/word/2010/wordprocessingShape" mc:Ignorable="w14 w15 w16se w16cid wp14">
+<w:document xmlns:wpc="http://schemas.microsoft.com/office/word/2010/wordprocessingCanvas" xmlns:cx="http://schemas.microsoft.com/office/drawing/2014/chartex" xmlns:cx1="http://schemas.microsoft.com/office/drawing/2015/9/8/chartex" xmlns:mc="http://schemas.openxmlformats.org/markup-compatibility/2006" xmlns:o="urn:schemas-microsoft-com:office:office" xmlns:r="http://schemas.openxmlformats.org/officeDocument/2006/relationships" xmlns:m="http://schemas.openxmlformats.org/officeDocument/2006/math" xmlns:v="urn:schemas-microsoft-com:vml" xmlns:wp14="http://schemas.microsoft.com/office/word/2010/wordprocessingDrawing" xmlns:wp="http://schemas.openxmlformats.org/drawingml/2006/wordprocessingDrawing" xmlns:w10="urn:schemas-microsoft-com:office:word" xmlns:w="http://schemas.openxmlformats.org/wordprocessingml/2006/main" xmlns:w14="http://schemas.microsoft.com/office/word/2010/wordml" xmlns:w15="http://schemas.microsoft.com/office/word/2012/wordml" xmlns:w16se="http://schemas.microsoft.com/office/word/2015/wordml/symex" xmlns:wpg="http://schemas.microsoft.com/office/word/2010/wordprocessingGroup" xmlns:wpi="http://schemas.microsoft.com/office/word/2010/wordprocessingInk" xmlns:wne="http://schemas.microsoft.com/office/word/2006/wordml" xmlns:wps="http://schemas.microsoft.com/office/word/2010/wordprocessingShape" mc:Ignorable="w14 w15 w16se wp14">
   <w:body>
     <w:p>
       <w:pPr>
@@ -97,7 +97,6 @@
         </w:rPr>
         <w:t xml:space="preserve">Nombre del primer autor/a </w:t>
       </w:r>
-      <w:proofErr w:type="gramStart"/>
       <w:r>
         <w:rPr>
           <w:rFonts w:ascii="Garamond" w:eastAsia="Arial" w:hAnsi="Garamond" w:cs="Arial"/>
@@ -115,17 +114,17 @@
           <w:color w:val="000000"/>
           <w:szCs w:val="20"/>
         </w:rPr>
-        <w:t>,...</w:t>
-      </w:r>
-      <w:proofErr w:type="gramEnd"/>
+        <w:t xml:space="preserve">,... , Nombre del segundo autor/a </w:t>
+      </w:r>
       <w:r>
         <w:rPr>
           <w:rFonts w:ascii="Garamond" w:eastAsia="Arial" w:hAnsi="Garamond" w:cs="Arial"/>
           <w:b/>
           <w:color w:val="000000"/>
           <w:szCs w:val="20"/>
-        </w:rPr>
-        <w:t xml:space="preserve"> , Nombre del segundo autor/a </w:t>
+          <w:vertAlign w:val="superscript"/>
+        </w:rPr>
+        <w:t>2</w:t>
       </w:r>
       <w:r>
         <w:rPr>
@@ -133,9 +132,8 @@
           <w:b/>
           <w:color w:val="000000"/>
           <w:szCs w:val="20"/>
-          <w:vertAlign w:val="superscript"/>
-        </w:rPr>
-        <w:t>2</w:t>
+        </w:rPr>
+        <w:t xml:space="preserve"> , Nombre del último autor </w:t>
       </w:r>
       <w:r>
         <w:rPr>
@@ -143,97 +141,138 @@
           <w:b/>
           <w:color w:val="000000"/>
           <w:szCs w:val="20"/>
-        </w:rPr>
-        <w:t xml:space="preserve"> , Nombre del último autor </w:t>
-      </w:r>
-      <w:r>
-        <w:rPr>
-          <w:rFonts w:ascii="Garamond" w:eastAsia="Arial" w:hAnsi="Garamond" w:cs="Arial"/>
-          <w:b/>
-          <w:color w:val="000000"/>
+          <w:vertAlign w:val="superscript"/>
+        </w:rPr>
+        <w:t>n</w:t>
+      </w:r>
+    </w:p>
+    <w:p>
+      <w:pPr>
+        <w:jc w:val="center"/>
+        <w:rPr>
+          <w:rFonts w:ascii="EB Garamond" w:eastAsia="EB Garamond" w:hAnsi="EB Garamond" w:cs="EB Garamond"/>
+          <w:color w:val="000000"/>
+          <w:sz w:val="20"/>
           <w:szCs w:val="20"/>
-          <w:vertAlign w:val="superscript"/>
+        </w:rPr>
+      </w:pPr>
+      <w:r>
+        <w:rPr>
+          <w:rFonts w:ascii="EB Garamond" w:eastAsia="EB Garamond" w:hAnsi="EB Garamond" w:cs="EB Garamond"/>
+          <w:color w:val="000000"/>
+          <w:sz w:val="20"/>
+          <w:szCs w:val="20"/>
+        </w:rPr>
+        <w:t xml:space="preserve">1 Universidad/Centro - </w:t>
+      </w:r>
+      <w:hyperlink r:id="rId7" w:history="1">
+        <w:r>
+          <w:rPr>
+            <w:rFonts w:ascii="EB Garamond" w:eastAsia="EB Garamond" w:hAnsi="EB Garamond" w:cs="EB Garamond"/>
+            <w:color w:val="000000"/>
+            <w:sz w:val="20"/>
+            <w:szCs w:val="20"/>
+          </w:rPr>
+          <w:t>correoautor@correo.com</w:t>
+        </w:r>
+      </w:hyperlink>
+      <w:r>
+        <w:rPr>
+          <w:rFonts w:ascii="EB Garamond" w:eastAsia="EB Garamond" w:hAnsi="EB Garamond" w:cs="EB Garamond"/>
+          <w:color w:val="000000"/>
+          <w:sz w:val="20"/>
+          <w:szCs w:val="20"/>
+        </w:rPr>
+        <w:t xml:space="preserve">  ORCID: 0000-0000-0000-0000</w:t>
+      </w:r>
+    </w:p>
+    <w:p>
+      <w:pPr>
+        <w:jc w:val="center"/>
+        <w:rPr>
+          <w:rFonts w:ascii="EB Garamond" w:eastAsia="EB Garamond" w:hAnsi="EB Garamond" w:cs="EB Garamond"/>
+          <w:color w:val="000000"/>
+          <w:sz w:val="20"/>
+          <w:szCs w:val="20"/>
+        </w:rPr>
+      </w:pPr>
+      <w:r>
+        <w:rPr>
+          <w:rFonts w:ascii="EB Garamond" w:eastAsia="EB Garamond" w:hAnsi="EB Garamond" w:cs="EB Garamond"/>
+          <w:color w:val="000000"/>
+          <w:sz w:val="20"/>
+          <w:szCs w:val="20"/>
+        </w:rPr>
+        <w:t xml:space="preserve">2 Universidad/Centro - </w:t>
+      </w:r>
+      <w:hyperlink r:id="rId8" w:history="1">
+        <w:r>
+          <w:rPr>
+            <w:rFonts w:ascii="EB Garamond" w:eastAsia="EB Garamond" w:hAnsi="EB Garamond" w:cs="EB Garamond"/>
+            <w:color w:val="000000"/>
+            <w:sz w:val="20"/>
+            <w:szCs w:val="20"/>
+          </w:rPr>
+          <w:t>correoautor@correo.com</w:t>
+        </w:r>
+      </w:hyperlink>
+      <w:r>
+        <w:rPr>
+          <w:rFonts w:ascii="EB Garamond" w:eastAsia="EB Garamond" w:hAnsi="EB Garamond" w:cs="EB Garamond"/>
+          <w:color w:val="000000"/>
+          <w:sz w:val="20"/>
+          <w:szCs w:val="20"/>
+        </w:rPr>
+        <w:t xml:space="preserve">  ORCID: 0000-0000-0000-0000</w:t>
+      </w:r>
+    </w:p>
+    <w:p>
+      <w:pPr>
+        <w:jc w:val="center"/>
+        <w:rPr>
+          <w:rFonts w:ascii="EB Garamond" w:eastAsia="EB Garamond" w:hAnsi="EB Garamond" w:cs="EB Garamond"/>
+          <w:color w:val="000000"/>
+          <w:sz w:val="20"/>
+          <w:szCs w:val="20"/>
+        </w:rPr>
+      </w:pPr>
+      <w:r>
+        <w:rPr>
+          <w:rFonts w:ascii="EB Garamond" w:eastAsia="EB Garamond" w:hAnsi="EB Garamond" w:cs="EB Garamond"/>
+          <w:color w:val="000000"/>
+          <w:sz w:val="20"/>
+          <w:szCs w:val="20"/>
         </w:rPr>
         <w:t>n</w:t>
       </w:r>
-    </w:p>
-    <w:p>
-      <w:pPr>
-        <w:pBdr>
-          <w:top w:val="nil"/>
-          <w:left w:val="nil"/>
-          <w:bottom w:val="nil"/>
-          <w:right w:val="nil"/>
-          <w:between w:val="nil"/>
-        </w:pBdr>
-        <w:ind w:firstLine="284"/>
-        <w:jc w:val="center"/>
-        <w:rPr>
-          <w:rFonts w:ascii="Garamond" w:eastAsia="Arial" w:hAnsi="Garamond" w:cs="Arial"/>
-          <w:color w:val="000000"/>
+      <w:r>
+        <w:rPr>
+          <w:rFonts w:ascii="EB Garamond" w:eastAsia="EB Garamond" w:hAnsi="EB Garamond" w:cs="EB Garamond"/>
+          <w:color w:val="000000"/>
+          <w:sz w:val="20"/>
           <w:szCs w:val="20"/>
         </w:rPr>
-      </w:pPr>
-      <w:r>
-        <w:rPr>
-          <w:rFonts w:ascii="Garamond" w:eastAsia="Arial" w:hAnsi="Garamond" w:cs="Arial"/>
-          <w:color w:val="000000"/>
+        <w:t xml:space="preserve"> Universidad/Centro - </w:t>
+      </w:r>
+      <w:hyperlink r:id="rId9" w:history="1">
+        <w:r>
+          <w:rPr>
+            <w:rFonts w:ascii="EB Garamond" w:eastAsia="EB Garamond" w:hAnsi="EB Garamond" w:cs="EB Garamond"/>
+            <w:color w:val="000000"/>
+            <w:sz w:val="20"/>
+            <w:szCs w:val="20"/>
+          </w:rPr>
+          <w:t>correoautor@correo.com</w:t>
+        </w:r>
+      </w:hyperlink>
+      <w:r>
+        <w:rPr>
+          <w:rFonts w:ascii="EB Garamond" w:eastAsia="EB Garamond" w:hAnsi="EB Garamond" w:cs="EB Garamond"/>
+          <w:color w:val="000000"/>
+          <w:sz w:val="20"/>
           <w:szCs w:val="20"/>
-          <w:vertAlign w:val="superscript"/>
-        </w:rPr>
-        <w:t>1</w:t>
-      </w:r>
-      <w:r>
-        <w:rPr>
-          <w:rFonts w:ascii="Garamond" w:eastAsia="Arial" w:hAnsi="Garamond" w:cs="Arial"/>
-          <w:color w:val="000000"/>
-          <w:szCs w:val="20"/>
-        </w:rPr>
-        <w:t xml:space="preserve"> Afiliación, país, </w:t>
-      </w:r>
-      <w:proofErr w:type="gramStart"/>
-      <w:r>
-        <w:rPr>
-          <w:rFonts w:ascii="Garamond" w:eastAsia="Arial" w:hAnsi="Garamond" w:cs="Arial"/>
-          <w:color w:val="000000"/>
-          <w:szCs w:val="20"/>
-        </w:rPr>
-        <w:t xml:space="preserve">mail  </w:t>
-      </w:r>
-      <w:r>
-        <w:rPr>
-          <w:rFonts w:ascii="Garamond" w:eastAsia="Arial" w:hAnsi="Garamond" w:cs="Arial"/>
-          <w:color w:val="000000"/>
-          <w:szCs w:val="20"/>
-          <w:vertAlign w:val="superscript"/>
-        </w:rPr>
-        <w:t>2</w:t>
-      </w:r>
-      <w:proofErr w:type="gramEnd"/>
-      <w:r>
-        <w:rPr>
-          <w:rFonts w:ascii="Garamond" w:eastAsia="Arial" w:hAnsi="Garamond" w:cs="Arial"/>
-          <w:color w:val="000000"/>
-          <w:szCs w:val="20"/>
-        </w:rPr>
-        <w:t xml:space="preserve"> Afiliación, país mail ....</w:t>
-      </w:r>
-      <w:r>
-        <w:rPr>
-          <w:rFonts w:ascii="Garamond" w:eastAsia="Arial" w:hAnsi="Garamond" w:cs="Arial"/>
-          <w:color w:val="000000"/>
-          <w:szCs w:val="20"/>
-          <w:vertAlign w:val="superscript"/>
-        </w:rPr>
-        <w:t>n</w:t>
-      </w:r>
-      <w:r>
-        <w:rPr>
-          <w:rFonts w:ascii="Garamond" w:eastAsia="Arial" w:hAnsi="Garamond" w:cs="Arial"/>
-          <w:color w:val="000000"/>
-          <w:szCs w:val="20"/>
-        </w:rPr>
-        <w:t xml:space="preserve"> Afiliación, país mail</w:t>
+        </w:rPr>
+        <w:t xml:space="preserve">  ORCID: 0000-0000-0000-0000</w:t>
       </w:r>
     </w:p>
     <w:p>
@@ -255,46 +294,6 @@
           <w:color w:val="000000"/>
         </w:rPr>
       </w:pPr>
-    </w:p>
-    <w:p>
-      <w:pPr>
-        <w:pBdr>
-          <w:top w:val="nil"/>
-          <w:left w:val="nil"/>
-          <w:bottom w:val="nil"/>
-          <w:right w:val="nil"/>
-          <w:between w:val="nil"/>
-        </w:pBdr>
-        <w:tabs>
-          <w:tab w:val="left" w:pos="426"/>
-        </w:tabs>
-        <w:spacing w:before="240" w:after="120"/>
-        <w:ind w:left="425" w:hanging="425"/>
-        <w:rPr>
-          <w:rFonts w:ascii="EB Garamond" w:eastAsia="EB Garamond" w:hAnsi="EB Garamond" w:cs="EB Garamond"/>
-          <w:color w:val="000000"/>
-        </w:rPr>
-      </w:pPr>
-    </w:p>
-    <w:p>
-      <w:pPr>
-        <w:pBdr>
-          <w:top w:val="nil"/>
-          <w:left w:val="nil"/>
-          <w:bottom w:val="nil"/>
-          <w:right w:val="nil"/>
-          <w:between w:val="nil"/>
-        </w:pBdr>
-        <w:tabs>
-          <w:tab w:val="left" w:pos="426"/>
-        </w:tabs>
-        <w:spacing w:before="240" w:after="120"/>
-        <w:ind w:left="425" w:hanging="425"/>
-        <w:rPr>
-          <w:rFonts w:ascii="EB Garamond" w:eastAsia="EB Garamond" w:hAnsi="EB Garamond" w:cs="EB Garamond"/>
-          <w:color w:val="000000"/>
-        </w:rPr>
-      </w:pPr>
       <w:r>
         <w:rPr>
           <w:rFonts w:ascii="EB Garamond" w:eastAsia="EB Garamond" w:hAnsi="EB Garamond" w:cs="EB Garamond"/>
@@ -310,6 +309,8 @@
         <w:tab/>
         <w:t>EPÍGRAFE PRINCIPAL</w:t>
       </w:r>
+      <w:bookmarkStart w:id="0" w:name="_GoBack"/>
+      <w:bookmarkEnd w:id="0"/>
     </w:p>
     <w:p>
       <w:pPr>
@@ -414,7 +415,7 @@
           <w:sz w:val="20"/>
           <w:szCs w:val="20"/>
         </w:rPr>
-        <w:t xml:space="preserve">La contribución debe tener un mínimo de 4000 palabras y un máximo de 5000. </w:t>
+        <w:t>La contribución debe tener un mínimo de 4000 palabras y un máximo de 5000. Se incluirán epígrafes relativos a Introducción, Metodología, Resultados y Discusión</w:t>
       </w:r>
       <w:r>
         <w:rPr>
@@ -423,7 +424,7 @@
           <w:sz w:val="20"/>
           <w:szCs w:val="20"/>
         </w:rPr>
-        <w:t>Se incluirán epígrafes relativos a Introducción, Metodología, Resultados y Discusión</w:t>
+        <w:t xml:space="preserve">/Conclusiones. </w:t>
       </w:r>
       <w:r>
         <w:rPr>
@@ -432,7 +433,7 @@
           <w:sz w:val="20"/>
           <w:szCs w:val="20"/>
         </w:rPr>
-        <w:t xml:space="preserve">/Conclusiones. </w:t>
+        <w:t xml:space="preserve">Las referencias bibliográficas deben incluir documentos publicados en los últimos 5 años. </w:t>
       </w:r>
       <w:r>
         <w:rPr>
@@ -441,36 +442,7 @@
           <w:sz w:val="20"/>
           <w:szCs w:val="20"/>
         </w:rPr>
-        <w:t xml:space="preserve">Las referencias bibliográficas deben incluir documentos publicados en los últimos 5 años. </w:t>
-      </w:r>
-      <w:r>
-        <w:rPr>
-          <w:rFonts w:ascii="EB Garamond" w:eastAsia="EB Garamond" w:hAnsi="EB Garamond" w:cs="EB Garamond"/>
-          <w:color w:val="000000"/>
-          <w:sz w:val="20"/>
-          <w:szCs w:val="20"/>
-        </w:rPr>
-        <w:t xml:space="preserve">El texto debe seguir el formato que se presenta en estos párrafos, con una fuente </w:t>
-      </w:r>
-      <w:proofErr w:type="spellStart"/>
-      <w:r>
-        <w:rPr>
-          <w:rFonts w:ascii="EB Garamond" w:eastAsia="EB Garamond" w:hAnsi="EB Garamond" w:cs="EB Garamond"/>
-          <w:color w:val="000000"/>
-          <w:sz w:val="20"/>
-          <w:szCs w:val="20"/>
-        </w:rPr>
-        <w:t>Garamont</w:t>
-      </w:r>
-      <w:proofErr w:type="spellEnd"/>
-      <w:r>
-        <w:rPr>
-          <w:rFonts w:ascii="EB Garamond" w:eastAsia="EB Garamond" w:hAnsi="EB Garamond" w:cs="EB Garamond"/>
-          <w:color w:val="000000"/>
-          <w:sz w:val="20"/>
-          <w:szCs w:val="20"/>
-        </w:rPr>
-        <w:t xml:space="preserve"> y un tamaño de letra 10. </w:t>
+        <w:t xml:space="preserve">El texto debe seguir el formato que se presenta en estos párrafos, con una fuente Garamont y un tamaño de letra 10. </w:t>
       </w:r>
       <w:r>
         <w:rPr>
@@ -610,25 +582,16 @@
           <w:szCs w:val="21"/>
         </w:rPr>
       </w:pPr>
-      <w:bookmarkStart w:id="0" w:name="_heading=h.gjdgxs" w:colFirst="0" w:colLast="0"/>
-      <w:bookmarkEnd w:id="0"/>
-      <w:r>
-        <w:rPr>
-          <w:rFonts w:ascii="EB Garamond" w:eastAsia="EB Garamond" w:hAnsi="EB Garamond" w:cs="EB Garamond"/>
-          <w:color w:val="000000"/>
-          <w:sz w:val="21"/>
-          <w:szCs w:val="21"/>
-        </w:rPr>
-        <w:t>En 1615 apareció su continuación con el título de Segunda parte del ingenioso caballero don Quijote de la Mancha. El Quijote de 1605 se publicó dividido en cuatro partes; pero al aparecer el Quijote de 1615 en calidad de Segunda parte de la obra, qued</w:t>
-      </w:r>
-      <w:r>
-        <w:rPr>
-          <w:rFonts w:ascii="EB Garamond" w:eastAsia="EB Garamond" w:hAnsi="EB Garamond" w:cs="EB Garamond"/>
-          <w:color w:val="000000"/>
-          <w:sz w:val="21"/>
-          <w:szCs w:val="21"/>
-        </w:rPr>
-        <w:t>ó revocada de hecho la partición en cuatro secciones del volumen publicado diez años antes por Cervantes.</w:t>
+      <w:bookmarkStart w:id="1" w:name="_heading=h.gjdgxs" w:colFirst="0" w:colLast="0"/>
+      <w:bookmarkEnd w:id="1"/>
+      <w:r>
+        <w:rPr>
+          <w:rFonts w:ascii="EB Garamond" w:eastAsia="EB Garamond" w:hAnsi="EB Garamond" w:cs="EB Garamond"/>
+          <w:color w:val="000000"/>
+          <w:sz w:val="21"/>
+          <w:szCs w:val="21"/>
+        </w:rPr>
+        <w:t>En 1615 apareció su continuación con el título de Segunda parte del ingenioso caballero don Quijote de la Mancha. El Quijote de 1605 se publicó dividido en cuatro partes; pero al aparecer el Quijote de 1615 en calidad de Segunda parte de la obra, quedó revocada de hecho la partición en cuatro secciones del volumen publicado diez años antes por Cervantes.</w:t>
       </w:r>
     </w:p>
     <w:p>
@@ -658,7 +621,7 @@
           <w:sz w:val="21"/>
           <w:szCs w:val="21"/>
         </w:rPr>
-        <w:t xml:space="preserve">2. Es la primera obra genuinamente desmitificadora de la tradición caballeresca y cortés por su tratamiento burlesco. Representa la primera novela moderna y la primera novela </w:t>
+        <w:t xml:space="preserve">2. Es la primera obra genuinamente desmitificadora de la tradición caballeresca y cortés por su tratamiento burlesco. Representa la primera novela moderna y la primera novela polifónica; como tal, ejerció un enorme influjo en toda la narrativa europea. Por </w:t>
       </w:r>
       <w:r>
         <w:rPr>
@@ -668,25 +631,7 @@
           <w:szCs w:val="21"/>
         </w:rPr>
         <w:lastRenderedPageBreak/>
-        <w:t>polifónica; como tal, ejerció un enorme influjo en toda la narrativa europea. Por</w:t>
-      </w:r>
-      <w:r>
-        <w:rPr>
-          <w:rFonts w:ascii="EB Garamond" w:eastAsia="EB Garamond" w:hAnsi="EB Garamond" w:cs="EB Garamond"/>
-          <w:color w:val="000000"/>
-          <w:sz w:val="21"/>
-          <w:szCs w:val="21"/>
-        </w:rPr>
-        <w:t xml:space="preserve"> considerarse «el mejor trabajo literario jamás escrito», encabezó la lista de las mejores obras literarias de la historia, que se estableció con las votaciones de cien grandes escritores de 54 nacionalidades a petición del Club Noruego del Libro en 2002; </w:t>
-      </w:r>
-      <w:r>
-        <w:rPr>
-          <w:rFonts w:ascii="EB Garamond" w:eastAsia="EB Garamond" w:hAnsi="EB Garamond" w:cs="EB Garamond"/>
-          <w:color w:val="000000"/>
-          <w:sz w:val="21"/>
-          <w:szCs w:val="21"/>
-        </w:rPr>
-        <w:t>así, fue la única excepción en el estricto orden alfabético que se había dispuesto.</w:t>
+        <w:t>considerarse «el mejor trabajo literario jamás escrito», encabezó la lista de las mejores obras literarias de la historia, que se estableció con las votaciones de cien grandes escritores de 54 nacionalidades a petición del Club Noruego del Libro en 2002; así, fue la única excepción en el estricto orden alfabético que se había dispuesto.</w:t>
       </w:r>
     </w:p>
     <w:p>
@@ -734,16 +679,7 @@
           <w:sz w:val="21"/>
           <w:szCs w:val="21"/>
         </w:rPr>
-        <w:t xml:space="preserve"> es la primera novela moderna y la primera novela pol</w:t>
-      </w:r>
-      <w:r>
-        <w:rPr>
-          <w:rFonts w:ascii="EB Garamond" w:eastAsia="EB Garamond" w:hAnsi="EB Garamond" w:cs="EB Garamond"/>
-          <w:color w:val="000000"/>
-          <w:sz w:val="21"/>
-          <w:szCs w:val="21"/>
-        </w:rPr>
-        <w:t>ifónica, y ejercerá un influjo abrumador en toda la narrativa europea posterior.</w:t>
+        <w:t xml:space="preserve"> es la primera novela moderna y la primera novela polifónica, y ejercerá un influjo abrumador en toda la narrativa europea posterior.</w:t>
       </w:r>
     </w:p>
     <w:p>
@@ -765,6 +701,871 @@
           <w:szCs w:val="21"/>
         </w:rPr>
       </w:pPr>
+      <w:r>
+        <w:rPr>
+          <w:rFonts w:ascii="EB Garamond" w:eastAsia="EB Garamond" w:hAnsi="EB Garamond" w:cs="EB Garamond"/>
+          <w:sz w:val="21"/>
+          <w:szCs w:val="21"/>
+        </w:rPr>
+        <w:t>Se pueden incluir tablas, gráficos o figuras. Se pueden incluir subepígrafes de forma razonable, siempre y cuando facilite la lectura.</w:t>
+      </w:r>
+    </w:p>
+    <w:p>
+      <w:pPr>
+        <w:pBdr>
+          <w:top w:val="nil"/>
+          <w:left w:val="nil"/>
+          <w:bottom w:val="nil"/>
+          <w:right w:val="nil"/>
+          <w:between w:val="nil"/>
+        </w:pBdr>
+        <w:shd w:val="clear" w:color="auto" w:fill="FFFFFF"/>
+        <w:spacing w:before="60" w:after="60" w:line="240" w:lineRule="auto"/>
+        <w:ind w:firstLine="425"/>
+        <w:jc w:val="both"/>
+        <w:rPr>
+          <w:rFonts w:ascii="EB Garamond" w:eastAsia="EB Garamond" w:hAnsi="EB Garamond" w:cs="EB Garamond"/>
+          <w:sz w:val="21"/>
+          <w:szCs w:val="21"/>
+        </w:rPr>
+      </w:pPr>
+      <w:r>
+        <w:rPr>
+          <w:rFonts w:ascii="EB Garamond" w:eastAsia="EB Garamond" w:hAnsi="EB Garamond" w:cs="EB Garamond"/>
+          <w:sz w:val="21"/>
+          <w:szCs w:val="21"/>
+        </w:rPr>
+        <w:t> </w:t>
+      </w:r>
+    </w:p>
+    <w:p>
+      <w:pPr>
+        <w:pBdr>
+          <w:top w:val="nil"/>
+          <w:left w:val="nil"/>
+          <w:bottom w:val="nil"/>
+          <w:right w:val="nil"/>
+          <w:between w:val="nil"/>
+        </w:pBdr>
+        <w:shd w:val="clear" w:color="auto" w:fill="FFFFFF"/>
+        <w:spacing w:before="60" w:after="60" w:line="240" w:lineRule="auto"/>
+        <w:ind w:firstLine="425"/>
+        <w:jc w:val="both"/>
+        <w:rPr>
+          <w:rFonts w:ascii="EB Garamond" w:eastAsia="EB Garamond" w:hAnsi="EB Garamond" w:cs="EB Garamond"/>
+          <w:b/>
+          <w:bCs/>
+          <w:sz w:val="21"/>
+          <w:szCs w:val="21"/>
+        </w:rPr>
+      </w:pPr>
+      <w:r>
+        <w:rPr>
+          <w:rFonts w:ascii="EB Garamond" w:eastAsia="EB Garamond" w:hAnsi="EB Garamond" w:cs="EB Garamond"/>
+          <w:b/>
+          <w:bCs/>
+          <w:sz w:val="21"/>
+          <w:szCs w:val="21"/>
+        </w:rPr>
+        <w:t xml:space="preserve">Figura x. </w:t>
+      </w:r>
+    </w:p>
+    <w:p>
+      <w:pPr>
+        <w:pBdr>
+          <w:top w:val="nil"/>
+          <w:left w:val="nil"/>
+          <w:bottom w:val="nil"/>
+          <w:right w:val="nil"/>
+          <w:between w:val="nil"/>
+        </w:pBdr>
+        <w:shd w:val="clear" w:color="auto" w:fill="FFFFFF"/>
+        <w:spacing w:before="60" w:after="60" w:line="240" w:lineRule="auto"/>
+        <w:ind w:firstLine="425"/>
+        <w:jc w:val="both"/>
+        <w:rPr>
+          <w:rFonts w:ascii="EB Garamond" w:eastAsia="EB Garamond" w:hAnsi="EB Garamond" w:cs="EB Garamond"/>
+          <w:bCs/>
+          <w:sz w:val="21"/>
+          <w:szCs w:val="21"/>
+        </w:rPr>
+      </w:pPr>
+      <w:r>
+        <w:rPr>
+          <w:rFonts w:ascii="EB Garamond" w:eastAsia="EB Garamond" w:hAnsi="EB Garamond" w:cs="EB Garamond"/>
+          <w:bCs/>
+          <w:sz w:val="21"/>
+          <w:szCs w:val="21"/>
+        </w:rPr>
+        <w:t>Título descriptivo de la figura.</w:t>
+      </w:r>
+    </w:p>
+    <w:p>
+      <w:pPr>
+        <w:pBdr>
+          <w:top w:val="nil"/>
+          <w:left w:val="nil"/>
+          <w:bottom w:val="nil"/>
+          <w:right w:val="nil"/>
+          <w:between w:val="nil"/>
+        </w:pBdr>
+        <w:shd w:val="clear" w:color="auto" w:fill="FFFFFF"/>
+        <w:spacing w:before="60" w:after="60" w:line="240" w:lineRule="auto"/>
+        <w:ind w:firstLine="425"/>
+        <w:jc w:val="both"/>
+        <w:cnfStyle w:val="001000000000" w:firstRow="0" w:lastRow="0" w:firstColumn="1" w:lastColumn="0" w:oddVBand="0" w:evenVBand="0" w:oddHBand="0" w:evenHBand="0" w:firstRowFirstColumn="0" w:firstRowLastColumn="0" w:lastRowFirstColumn="0" w:lastRowLastColumn="0"/>
+        <w:rPr>
+          <w:rFonts w:ascii="EB Garamond" w:eastAsia="EB Garamond" w:hAnsi="EB Garamond" w:cs="EB Garamond"/>
+          <w:b/>
+          <w:bCs/>
+          <w:sz w:val="21"/>
+          <w:szCs w:val="21"/>
+        </w:rPr>
+      </w:pPr>
+      <w:r>
+        <w:rPr>
+          <w:rFonts w:ascii="EB Garamond" w:eastAsia="EB Garamond" w:hAnsi="EB Garamond" w:cs="EB Garamond"/>
+          <w:b/>
+          <w:bCs/>
+          <w:sz w:val="21"/>
+          <w:szCs w:val="21"/>
+        </w:rPr>
+        <w:drawing>
+          <wp:inline distT="0" distB="0" distL="0" distR="0" wp14:anchorId="0B8F2701" wp14:editId="0DD7FA81">
+            <wp:extent cx="2057400" cy="1238250"/>
+            <wp:effectExtent l="0" t="0" r="0" b="0"/>
+            <wp:docPr id="3" name="Imagen 3" descr="C:\Users\Usuario\Desktop\images.jpg"/>
+            <wp:cNvGraphicFramePr>
+              <a:graphicFrameLocks xmlns:a="http://schemas.openxmlformats.org/drawingml/2006/main" noChangeAspect="1"/>
+            </wp:cNvGraphicFramePr>
+            <a:graphic xmlns:a="http://schemas.openxmlformats.org/drawingml/2006/main">
+              <a:graphicData uri="http://schemas.openxmlformats.org/drawingml/2006/picture">
+                <pic:pic xmlns:pic="http://schemas.openxmlformats.org/drawingml/2006/picture">
+                  <pic:nvPicPr>
+                    <pic:cNvPr id="0" name="Picture 3" descr="C:\Users\Usuario\Desktop\images.jpg"/>
+                    <pic:cNvPicPr>
+                      <a:picLocks noChangeAspect="1" noChangeArrowheads="1"/>
+                    </pic:cNvPicPr>
+                  </pic:nvPicPr>
+                  <pic:blipFill>
+                    <a:blip r:embed="rId10">
+                      <a:extLst>
+                        <a:ext uri="{28A0092B-C50C-407E-A947-70E740481C1C}">
+                          <a14:useLocalDpi xmlns:a14="http://schemas.microsoft.com/office/drawing/2010/main" val="0"/>
+                        </a:ext>
+                      </a:extLst>
+                    </a:blip>
+                    <a:srcRect/>
+                    <a:stretch>
+                      <a:fillRect/>
+                    </a:stretch>
+                  </pic:blipFill>
+                  <pic:spPr bwMode="auto">
+                    <a:xfrm>
+                      <a:off x="0" y="0"/>
+                      <a:ext cx="2057400" cy="1238250"/>
+                    </a:xfrm>
+                    <a:prstGeom prst="rect">
+                      <a:avLst/>
+                    </a:prstGeom>
+                    <a:noFill/>
+                    <a:ln>
+                      <a:noFill/>
+                    </a:ln>
+                  </pic:spPr>
+                </pic:pic>
+              </a:graphicData>
+            </a:graphic>
+          </wp:inline>
+        </w:drawing>
+      </w:r>
+    </w:p>
+    <w:p>
+      <w:pPr>
+        <w:pBdr>
+          <w:top w:val="nil"/>
+          <w:left w:val="nil"/>
+          <w:bottom w:val="nil"/>
+          <w:right w:val="nil"/>
+          <w:between w:val="nil"/>
+        </w:pBdr>
+        <w:shd w:val="clear" w:color="auto" w:fill="FFFFFF"/>
+        <w:spacing w:before="60" w:after="60" w:line="240" w:lineRule="auto"/>
+        <w:ind w:firstLine="425"/>
+        <w:jc w:val="both"/>
+        <w:cnfStyle w:val="001000000000" w:firstRow="0" w:lastRow="0" w:firstColumn="1" w:lastColumn="0" w:oddVBand="0" w:evenVBand="0" w:oddHBand="0" w:evenHBand="0" w:firstRowFirstColumn="0" w:firstRowLastColumn="0" w:lastRowFirstColumn="0" w:lastRowLastColumn="0"/>
+        <w:rPr>
+          <w:rFonts w:ascii="EB Garamond" w:eastAsia="EB Garamond" w:hAnsi="EB Garamond" w:cs="EB Garamond"/>
+          <w:bCs/>
+          <w:sz w:val="21"/>
+          <w:szCs w:val="21"/>
+        </w:rPr>
+      </w:pPr>
+      <w:r>
+        <w:rPr>
+          <w:rFonts w:ascii="EB Garamond" w:eastAsia="EB Garamond" w:hAnsi="EB Garamond" w:cs="EB Garamond"/>
+          <w:bCs/>
+          <w:sz w:val="21"/>
+          <w:szCs w:val="21"/>
+        </w:rPr>
+        <w:t>Nota: (en caso de ser necesario)</w:t>
+      </w:r>
+    </w:p>
+    <w:p>
+      <w:pPr>
+        <w:pBdr>
+          <w:top w:val="nil"/>
+          <w:left w:val="nil"/>
+          <w:bottom w:val="nil"/>
+          <w:right w:val="nil"/>
+          <w:between w:val="nil"/>
+        </w:pBdr>
+        <w:shd w:val="clear" w:color="auto" w:fill="FFFFFF"/>
+        <w:spacing w:before="60" w:after="60" w:line="240" w:lineRule="auto"/>
+        <w:ind w:firstLine="425"/>
+        <w:jc w:val="both"/>
+        <w:rPr>
+          <w:rFonts w:ascii="EB Garamond" w:eastAsia="EB Garamond" w:hAnsi="EB Garamond" w:cs="EB Garamond"/>
+          <w:b/>
+          <w:bCs/>
+          <w:sz w:val="21"/>
+          <w:szCs w:val="21"/>
+        </w:rPr>
+      </w:pPr>
+    </w:p>
+    <w:p>
+      <w:pPr>
+        <w:pBdr>
+          <w:top w:val="nil"/>
+          <w:left w:val="nil"/>
+          <w:bottom w:val="nil"/>
+          <w:right w:val="nil"/>
+          <w:between w:val="nil"/>
+        </w:pBdr>
+        <w:shd w:val="clear" w:color="auto" w:fill="FFFFFF"/>
+        <w:spacing w:before="60" w:after="60" w:line="240" w:lineRule="auto"/>
+        <w:ind w:firstLine="425"/>
+        <w:jc w:val="both"/>
+        <w:rPr>
+          <w:rFonts w:ascii="EB Garamond" w:eastAsia="EB Garamond" w:hAnsi="EB Garamond" w:cs="EB Garamond"/>
+          <w:sz w:val="21"/>
+          <w:szCs w:val="21"/>
+        </w:rPr>
+      </w:pPr>
+      <w:r>
+        <w:rPr>
+          <w:rFonts w:ascii="EB Garamond" w:eastAsia="EB Garamond" w:hAnsi="EB Garamond" w:cs="EB Garamond"/>
+          <w:b/>
+          <w:bCs/>
+          <w:sz w:val="21"/>
+          <w:szCs w:val="21"/>
+        </w:rPr>
+        <w:t>Tabla x</w:t>
+      </w:r>
+      <w:r>
+        <w:rPr>
+          <w:rFonts w:ascii="EB Garamond" w:eastAsia="EB Garamond" w:hAnsi="EB Garamond" w:cs="EB Garamond"/>
+          <w:sz w:val="21"/>
+          <w:szCs w:val="21"/>
+        </w:rPr>
+        <w:t xml:space="preserve">. </w:t>
+      </w:r>
+    </w:p>
+    <w:p>
+      <w:pPr>
+        <w:pBdr>
+          <w:top w:val="nil"/>
+          <w:left w:val="nil"/>
+          <w:bottom w:val="nil"/>
+          <w:right w:val="nil"/>
+          <w:between w:val="nil"/>
+        </w:pBdr>
+        <w:shd w:val="clear" w:color="auto" w:fill="FFFFFF"/>
+        <w:spacing w:before="60" w:after="60" w:line="240" w:lineRule="auto"/>
+        <w:ind w:firstLine="425"/>
+        <w:jc w:val="both"/>
+        <w:rPr>
+          <w:rFonts w:ascii="EB Garamond" w:eastAsia="EB Garamond" w:hAnsi="EB Garamond" w:cs="EB Garamond"/>
+          <w:sz w:val="21"/>
+          <w:szCs w:val="21"/>
+        </w:rPr>
+      </w:pPr>
+      <w:r>
+        <w:rPr>
+          <w:rFonts w:ascii="EB Garamond" w:eastAsia="EB Garamond" w:hAnsi="EB Garamond" w:cs="EB Garamond"/>
+          <w:sz w:val="21"/>
+          <w:szCs w:val="21"/>
+        </w:rPr>
+        <w:t xml:space="preserve">Título descriptivo de la tabla. </w:t>
+      </w:r>
+    </w:p>
+    <w:tbl>
+      <w:tblPr>
+        <w:tblStyle w:val="Tablanormal2"/>
+        <w:tblW w:w="5000" w:type="pct"/>
+        <w:tblBorders>
+          <w:top w:val="none" w:sz="0" w:space="0" w:color="auto"/>
+          <w:bottom w:val="none" w:sz="0" w:space="0" w:color="auto"/>
+        </w:tblBorders>
+        <w:tblLook w:val="04A0" w:firstRow="1" w:lastRow="0" w:firstColumn="1" w:lastColumn="0" w:noHBand="0" w:noVBand="1"/>
+      </w:tblPr>
+      <w:tblGrid>
+        <w:gridCol w:w="2457"/>
+        <w:gridCol w:w="2457"/>
+        <w:gridCol w:w="2457"/>
+      </w:tblGrid>
+      <w:tr>
+        <w:trPr>
+          <w:cnfStyle w:val="100000000000" w:firstRow="1" w:lastRow="0" w:firstColumn="0" w:lastColumn="0" w:oddVBand="0" w:evenVBand="0" w:oddHBand="0" w:evenHBand="0" w:firstRowFirstColumn="0" w:firstRowLastColumn="0" w:lastRowFirstColumn="0" w:lastRowLastColumn="0"/>
+          <w:trHeight w:val="113"/>
+        </w:trPr>
+        <w:tc>
+          <w:tcPr>
+            <w:cnfStyle w:val="001000000000" w:firstRow="0" w:lastRow="0" w:firstColumn="1" w:lastColumn="0" w:oddVBand="0" w:evenVBand="0" w:oddHBand="0" w:evenHBand="0" w:firstRowFirstColumn="0" w:firstRowLastColumn="0" w:lastRowFirstColumn="0" w:lastRowLastColumn="0"/>
+            <w:tcW w:w="2834" w:type="dxa"/>
+            <w:tcBorders>
+              <w:top w:val="single" w:sz="8" w:space="0" w:color="7F7F7F"/>
+              <w:left w:val="nil"/>
+              <w:bottom w:val="single" w:sz="8" w:space="0" w:color="7F7F7F"/>
+              <w:right w:val="nil"/>
+            </w:tcBorders>
+            <w:hideMark/>
+          </w:tcPr>
+          <w:p>
+            <w:pPr>
+              <w:pBdr>
+                <w:top w:val="nil"/>
+                <w:left w:val="nil"/>
+                <w:bottom w:val="nil"/>
+                <w:right w:val="nil"/>
+                <w:between w:val="nil"/>
+              </w:pBdr>
+              <w:shd w:val="clear" w:color="auto" w:fill="FFFFFF"/>
+              <w:spacing w:before="60" w:after="60"/>
+              <w:ind w:firstLine="425"/>
+              <w:jc w:val="both"/>
+              <w:rPr>
+                <w:rFonts w:ascii="EB Garamond" w:eastAsia="EB Garamond" w:hAnsi="EB Garamond" w:cs="EB Garamond"/>
+                <w:sz w:val="21"/>
+                <w:szCs w:val="21"/>
+              </w:rPr>
+            </w:pPr>
+            <w:r>
+              <w:rPr>
+                <w:rFonts w:ascii="EB Garamond" w:eastAsia="EB Garamond" w:hAnsi="EB Garamond" w:cs="EB Garamond"/>
+                <w:sz w:val="21"/>
+                <w:szCs w:val="21"/>
+              </w:rPr>
+              <w:t>Cabecera 1</w:t>
+            </w:r>
+          </w:p>
+        </w:tc>
+        <w:tc>
+          <w:tcPr>
+            <w:tcW w:w="2835" w:type="dxa"/>
+            <w:tcBorders>
+              <w:top w:val="single" w:sz="8" w:space="0" w:color="7F7F7F"/>
+              <w:left w:val="nil"/>
+              <w:bottom w:val="single" w:sz="8" w:space="0" w:color="7F7F7F"/>
+              <w:right w:val="nil"/>
+            </w:tcBorders>
+            <w:hideMark/>
+          </w:tcPr>
+          <w:p>
+            <w:pPr>
+              <w:pBdr>
+                <w:top w:val="nil"/>
+                <w:left w:val="nil"/>
+                <w:bottom w:val="nil"/>
+                <w:right w:val="nil"/>
+                <w:between w:val="nil"/>
+              </w:pBdr>
+              <w:shd w:val="clear" w:color="auto" w:fill="FFFFFF"/>
+              <w:spacing w:before="60" w:after="60"/>
+              <w:ind w:firstLine="425"/>
+              <w:jc w:val="both"/>
+              <w:cnfStyle w:val="100000000000" w:firstRow="1" w:lastRow="0" w:firstColumn="0" w:lastColumn="0" w:oddVBand="0" w:evenVBand="0" w:oddHBand="0" w:evenHBand="0" w:firstRowFirstColumn="0" w:firstRowLastColumn="0" w:lastRowFirstColumn="0" w:lastRowLastColumn="0"/>
+              <w:rPr>
+                <w:rFonts w:ascii="EB Garamond" w:eastAsia="EB Garamond" w:hAnsi="EB Garamond" w:cs="EB Garamond"/>
+                <w:sz w:val="21"/>
+                <w:szCs w:val="21"/>
+              </w:rPr>
+            </w:pPr>
+            <w:r>
+              <w:rPr>
+                <w:rFonts w:ascii="EB Garamond" w:eastAsia="EB Garamond" w:hAnsi="EB Garamond" w:cs="EB Garamond"/>
+                <w:sz w:val="21"/>
+                <w:szCs w:val="21"/>
+              </w:rPr>
+              <w:t>Cabecera 2</w:t>
+            </w:r>
+          </w:p>
+        </w:tc>
+        <w:tc>
+          <w:tcPr>
+            <w:tcW w:w="2835" w:type="dxa"/>
+            <w:tcBorders>
+              <w:top w:val="single" w:sz="8" w:space="0" w:color="7F7F7F"/>
+              <w:left w:val="nil"/>
+              <w:bottom w:val="single" w:sz="8" w:space="0" w:color="7F7F7F"/>
+              <w:right w:val="nil"/>
+            </w:tcBorders>
+            <w:hideMark/>
+          </w:tcPr>
+          <w:p>
+            <w:pPr>
+              <w:pBdr>
+                <w:top w:val="nil"/>
+                <w:left w:val="nil"/>
+                <w:bottom w:val="nil"/>
+                <w:right w:val="nil"/>
+                <w:between w:val="nil"/>
+              </w:pBdr>
+              <w:shd w:val="clear" w:color="auto" w:fill="FFFFFF"/>
+              <w:spacing w:before="60" w:after="60"/>
+              <w:ind w:firstLine="425"/>
+              <w:jc w:val="both"/>
+              <w:cnfStyle w:val="100000000000" w:firstRow="1" w:lastRow="0" w:firstColumn="0" w:lastColumn="0" w:oddVBand="0" w:evenVBand="0" w:oddHBand="0" w:evenHBand="0" w:firstRowFirstColumn="0" w:firstRowLastColumn="0" w:lastRowFirstColumn="0" w:lastRowLastColumn="0"/>
+              <w:rPr>
+                <w:rFonts w:ascii="EB Garamond" w:eastAsia="EB Garamond" w:hAnsi="EB Garamond" w:cs="EB Garamond"/>
+                <w:sz w:val="21"/>
+                <w:szCs w:val="21"/>
+              </w:rPr>
+            </w:pPr>
+            <w:r>
+              <w:rPr>
+                <w:rFonts w:ascii="EB Garamond" w:eastAsia="EB Garamond" w:hAnsi="EB Garamond" w:cs="EB Garamond"/>
+                <w:sz w:val="21"/>
+                <w:szCs w:val="21"/>
+              </w:rPr>
+              <w:t>Cabecera 3</w:t>
+            </w:r>
+          </w:p>
+        </w:tc>
+      </w:tr>
+      <w:tr>
+        <w:tc>
+          <w:tcPr>
+            <w:cnfStyle w:val="001000000000" w:firstRow="0" w:lastRow="0" w:firstColumn="1" w:lastColumn="0" w:oddVBand="0" w:evenVBand="0" w:oddHBand="0" w:evenHBand="0" w:firstRowFirstColumn="0" w:firstRowLastColumn="0" w:lastRowFirstColumn="0" w:lastRowLastColumn="0"/>
+            <w:tcW w:w="2834" w:type="dxa"/>
+            <w:tcBorders>
+              <w:top w:val="nil"/>
+              <w:left w:val="nil"/>
+              <w:bottom w:val="single" w:sz="8" w:space="0" w:color="7F7F7F"/>
+              <w:right w:val="nil"/>
+            </w:tcBorders>
+            <w:hideMark/>
+          </w:tcPr>
+          <w:p>
+            <w:pPr>
+              <w:pBdr>
+                <w:top w:val="nil"/>
+                <w:left w:val="nil"/>
+                <w:bottom w:val="nil"/>
+                <w:right w:val="nil"/>
+                <w:between w:val="nil"/>
+              </w:pBdr>
+              <w:shd w:val="clear" w:color="auto" w:fill="FFFFFF"/>
+              <w:spacing w:before="60" w:after="60"/>
+              <w:ind w:firstLine="425"/>
+              <w:jc w:val="both"/>
+              <w:rPr>
+                <w:rFonts w:ascii="EB Garamond" w:eastAsia="EB Garamond" w:hAnsi="EB Garamond" w:cs="EB Garamond"/>
+                <w:sz w:val="21"/>
+                <w:szCs w:val="21"/>
+              </w:rPr>
+            </w:pPr>
+            <w:r>
+              <w:rPr>
+                <w:rFonts w:ascii="EB Garamond" w:eastAsia="EB Garamond" w:hAnsi="EB Garamond" w:cs="EB Garamond"/>
+                <w:sz w:val="21"/>
+                <w:szCs w:val="21"/>
+              </w:rPr>
+              <w:t> </w:t>
+            </w:r>
+          </w:p>
+        </w:tc>
+        <w:tc>
+          <w:tcPr>
+            <w:tcW w:w="2835" w:type="dxa"/>
+            <w:tcBorders>
+              <w:top w:val="nil"/>
+              <w:left w:val="nil"/>
+              <w:bottom w:val="single" w:sz="8" w:space="0" w:color="7F7F7F"/>
+              <w:right w:val="nil"/>
+            </w:tcBorders>
+            <w:hideMark/>
+          </w:tcPr>
+          <w:p>
+            <w:pPr>
+              <w:pBdr>
+                <w:top w:val="nil"/>
+                <w:left w:val="nil"/>
+                <w:bottom w:val="nil"/>
+                <w:right w:val="nil"/>
+                <w:between w:val="nil"/>
+              </w:pBdr>
+              <w:shd w:val="clear" w:color="auto" w:fill="FFFFFF"/>
+              <w:spacing w:before="60" w:after="60"/>
+              <w:ind w:firstLine="425"/>
+              <w:jc w:val="both"/>
+              <w:cnfStyle w:val="000000000000" w:firstRow="0" w:lastRow="0" w:firstColumn="0" w:lastColumn="0" w:oddVBand="0" w:evenVBand="0" w:oddHBand="0" w:evenHBand="0" w:firstRowFirstColumn="0" w:firstRowLastColumn="0" w:lastRowFirstColumn="0" w:lastRowLastColumn="0"/>
+              <w:rPr>
+                <w:rFonts w:ascii="EB Garamond" w:eastAsia="EB Garamond" w:hAnsi="EB Garamond" w:cs="EB Garamond"/>
+                <w:sz w:val="21"/>
+                <w:szCs w:val="21"/>
+              </w:rPr>
+            </w:pPr>
+            <w:r>
+              <w:rPr>
+                <w:rFonts w:ascii="EB Garamond" w:eastAsia="EB Garamond" w:hAnsi="EB Garamond" w:cs="EB Garamond"/>
+                <w:sz w:val="21"/>
+                <w:szCs w:val="21"/>
+              </w:rPr>
+              <w:t> </w:t>
+            </w:r>
+          </w:p>
+        </w:tc>
+        <w:tc>
+          <w:tcPr>
+            <w:tcW w:w="2835" w:type="dxa"/>
+            <w:tcBorders>
+              <w:top w:val="nil"/>
+              <w:left w:val="nil"/>
+              <w:bottom w:val="single" w:sz="8" w:space="0" w:color="7F7F7F"/>
+              <w:right w:val="nil"/>
+            </w:tcBorders>
+            <w:hideMark/>
+          </w:tcPr>
+          <w:p>
+            <w:pPr>
+              <w:pBdr>
+                <w:top w:val="nil"/>
+                <w:left w:val="nil"/>
+                <w:bottom w:val="nil"/>
+                <w:right w:val="nil"/>
+                <w:between w:val="nil"/>
+              </w:pBdr>
+              <w:shd w:val="clear" w:color="auto" w:fill="FFFFFF"/>
+              <w:spacing w:before="60" w:after="60"/>
+              <w:ind w:firstLine="425"/>
+              <w:jc w:val="both"/>
+              <w:cnfStyle w:val="000000000000" w:firstRow="0" w:lastRow="0" w:firstColumn="0" w:lastColumn="0" w:oddVBand="0" w:evenVBand="0" w:oddHBand="0" w:evenHBand="0" w:firstRowFirstColumn="0" w:firstRowLastColumn="0" w:lastRowFirstColumn="0" w:lastRowLastColumn="0"/>
+              <w:rPr>
+                <w:rFonts w:ascii="EB Garamond" w:eastAsia="EB Garamond" w:hAnsi="EB Garamond" w:cs="EB Garamond"/>
+                <w:sz w:val="21"/>
+                <w:szCs w:val="21"/>
+              </w:rPr>
+            </w:pPr>
+            <w:r>
+              <w:rPr>
+                <w:rFonts w:ascii="EB Garamond" w:eastAsia="EB Garamond" w:hAnsi="EB Garamond" w:cs="EB Garamond"/>
+                <w:sz w:val="21"/>
+                <w:szCs w:val="21"/>
+              </w:rPr>
+              <w:t> </w:t>
+            </w:r>
+          </w:p>
+        </w:tc>
+      </w:tr>
+      <w:tr>
+        <w:tc>
+          <w:tcPr>
+            <w:cnfStyle w:val="001000000000" w:firstRow="0" w:lastRow="0" w:firstColumn="1" w:lastColumn="0" w:oddVBand="0" w:evenVBand="0" w:oddHBand="0" w:evenHBand="0" w:firstRowFirstColumn="0" w:firstRowLastColumn="0" w:lastRowFirstColumn="0" w:lastRowLastColumn="0"/>
+            <w:tcW w:w="2834" w:type="dxa"/>
+            <w:tcBorders>
+              <w:top w:val="nil"/>
+              <w:left w:val="nil"/>
+              <w:bottom w:val="nil"/>
+              <w:right w:val="nil"/>
+            </w:tcBorders>
+            <w:hideMark/>
+          </w:tcPr>
+          <w:p>
+            <w:pPr>
+              <w:pBdr>
+                <w:top w:val="nil"/>
+                <w:left w:val="nil"/>
+                <w:bottom w:val="nil"/>
+                <w:right w:val="nil"/>
+                <w:between w:val="nil"/>
+              </w:pBdr>
+              <w:shd w:val="clear" w:color="auto" w:fill="FFFFFF"/>
+              <w:spacing w:before="60" w:after="60"/>
+              <w:ind w:firstLine="425"/>
+              <w:jc w:val="both"/>
+              <w:rPr>
+                <w:rFonts w:ascii="EB Garamond" w:eastAsia="EB Garamond" w:hAnsi="EB Garamond" w:cs="EB Garamond"/>
+                <w:sz w:val="21"/>
+                <w:szCs w:val="21"/>
+              </w:rPr>
+            </w:pPr>
+            <w:r>
+              <w:rPr>
+                <w:rFonts w:ascii="EB Garamond" w:eastAsia="EB Garamond" w:hAnsi="EB Garamond" w:cs="EB Garamond"/>
+                <w:sz w:val="21"/>
+                <w:szCs w:val="21"/>
+              </w:rPr>
+              <w:t> </w:t>
+            </w:r>
+          </w:p>
+        </w:tc>
+        <w:tc>
+          <w:tcPr>
+            <w:tcW w:w="2835" w:type="dxa"/>
+            <w:tcBorders>
+              <w:top w:val="nil"/>
+              <w:left w:val="nil"/>
+              <w:bottom w:val="nil"/>
+              <w:right w:val="nil"/>
+            </w:tcBorders>
+            <w:hideMark/>
+          </w:tcPr>
+          <w:p>
+            <w:pPr>
+              <w:pBdr>
+                <w:top w:val="nil"/>
+                <w:left w:val="nil"/>
+                <w:bottom w:val="nil"/>
+                <w:right w:val="nil"/>
+                <w:between w:val="nil"/>
+              </w:pBdr>
+              <w:shd w:val="clear" w:color="auto" w:fill="FFFFFF"/>
+              <w:spacing w:before="60" w:after="60"/>
+              <w:ind w:firstLine="425"/>
+              <w:jc w:val="both"/>
+              <w:cnfStyle w:val="000000000000" w:firstRow="0" w:lastRow="0" w:firstColumn="0" w:lastColumn="0" w:oddVBand="0" w:evenVBand="0" w:oddHBand="0" w:evenHBand="0" w:firstRowFirstColumn="0" w:firstRowLastColumn="0" w:lastRowFirstColumn="0" w:lastRowLastColumn="0"/>
+              <w:rPr>
+                <w:rFonts w:ascii="EB Garamond" w:eastAsia="EB Garamond" w:hAnsi="EB Garamond" w:cs="EB Garamond"/>
+                <w:sz w:val="21"/>
+                <w:szCs w:val="21"/>
+              </w:rPr>
+            </w:pPr>
+            <w:r>
+              <w:rPr>
+                <w:rFonts w:ascii="EB Garamond" w:eastAsia="EB Garamond" w:hAnsi="EB Garamond" w:cs="EB Garamond"/>
+                <w:sz w:val="21"/>
+                <w:szCs w:val="21"/>
+              </w:rPr>
+              <w:t> </w:t>
+            </w:r>
+          </w:p>
+        </w:tc>
+        <w:tc>
+          <w:tcPr>
+            <w:tcW w:w="2835" w:type="dxa"/>
+            <w:tcBorders>
+              <w:top w:val="nil"/>
+              <w:left w:val="nil"/>
+              <w:bottom w:val="nil"/>
+              <w:right w:val="nil"/>
+            </w:tcBorders>
+            <w:hideMark/>
+          </w:tcPr>
+          <w:p>
+            <w:pPr>
+              <w:pBdr>
+                <w:top w:val="nil"/>
+                <w:left w:val="nil"/>
+                <w:bottom w:val="nil"/>
+                <w:right w:val="nil"/>
+                <w:between w:val="nil"/>
+              </w:pBdr>
+              <w:shd w:val="clear" w:color="auto" w:fill="FFFFFF"/>
+              <w:spacing w:before="60" w:after="60"/>
+              <w:ind w:firstLine="425"/>
+              <w:jc w:val="both"/>
+              <w:cnfStyle w:val="000000000000" w:firstRow="0" w:lastRow="0" w:firstColumn="0" w:lastColumn="0" w:oddVBand="0" w:evenVBand="0" w:oddHBand="0" w:evenHBand="0" w:firstRowFirstColumn="0" w:firstRowLastColumn="0" w:lastRowFirstColumn="0" w:lastRowLastColumn="0"/>
+              <w:rPr>
+                <w:rFonts w:ascii="EB Garamond" w:eastAsia="EB Garamond" w:hAnsi="EB Garamond" w:cs="EB Garamond"/>
+                <w:sz w:val="21"/>
+                <w:szCs w:val="21"/>
+              </w:rPr>
+            </w:pPr>
+            <w:r>
+              <w:rPr>
+                <w:rFonts w:ascii="EB Garamond" w:eastAsia="EB Garamond" w:hAnsi="EB Garamond" w:cs="EB Garamond"/>
+                <w:sz w:val="21"/>
+                <w:szCs w:val="21"/>
+              </w:rPr>
+              <w:t> </w:t>
+            </w:r>
+          </w:p>
+        </w:tc>
+      </w:tr>
+      <w:tr>
+        <w:tc>
+          <w:tcPr>
+            <w:cnfStyle w:val="001000000000" w:firstRow="0" w:lastRow="0" w:firstColumn="1" w:lastColumn="0" w:oddVBand="0" w:evenVBand="0" w:oddHBand="0" w:evenHBand="0" w:firstRowFirstColumn="0" w:firstRowLastColumn="0" w:lastRowFirstColumn="0" w:lastRowLastColumn="0"/>
+            <w:tcW w:w="2834" w:type="dxa"/>
+            <w:tcBorders>
+              <w:top w:val="single" w:sz="8" w:space="0" w:color="7F7F7F"/>
+              <w:left w:val="nil"/>
+              <w:bottom w:val="single" w:sz="8" w:space="0" w:color="7F7F7F"/>
+              <w:right w:val="nil"/>
+            </w:tcBorders>
+            <w:hideMark/>
+          </w:tcPr>
+          <w:p>
+            <w:pPr>
+              <w:pBdr>
+                <w:top w:val="nil"/>
+                <w:left w:val="nil"/>
+                <w:bottom w:val="nil"/>
+                <w:right w:val="nil"/>
+                <w:between w:val="nil"/>
+              </w:pBdr>
+              <w:shd w:val="clear" w:color="auto" w:fill="FFFFFF"/>
+              <w:spacing w:before="60" w:after="60"/>
+              <w:ind w:firstLine="425"/>
+              <w:jc w:val="both"/>
+              <w:rPr>
+                <w:rFonts w:ascii="EB Garamond" w:eastAsia="EB Garamond" w:hAnsi="EB Garamond" w:cs="EB Garamond"/>
+                <w:sz w:val="21"/>
+                <w:szCs w:val="21"/>
+              </w:rPr>
+            </w:pPr>
+            <w:r>
+              <w:rPr>
+                <w:rFonts w:ascii="EB Garamond" w:eastAsia="EB Garamond" w:hAnsi="EB Garamond" w:cs="EB Garamond"/>
+                <w:sz w:val="21"/>
+                <w:szCs w:val="21"/>
+              </w:rPr>
+              <w:t> </w:t>
+            </w:r>
+          </w:p>
+        </w:tc>
+        <w:tc>
+          <w:tcPr>
+            <w:tcW w:w="2835" w:type="dxa"/>
+            <w:tcBorders>
+              <w:top w:val="single" w:sz="8" w:space="0" w:color="7F7F7F"/>
+              <w:left w:val="nil"/>
+              <w:bottom w:val="single" w:sz="8" w:space="0" w:color="7F7F7F"/>
+              <w:right w:val="nil"/>
+            </w:tcBorders>
+            <w:hideMark/>
+          </w:tcPr>
+          <w:p>
+            <w:pPr>
+              <w:pBdr>
+                <w:top w:val="nil"/>
+                <w:left w:val="nil"/>
+                <w:bottom w:val="nil"/>
+                <w:right w:val="nil"/>
+                <w:between w:val="nil"/>
+              </w:pBdr>
+              <w:shd w:val="clear" w:color="auto" w:fill="FFFFFF"/>
+              <w:spacing w:before="60" w:after="60"/>
+              <w:ind w:firstLine="425"/>
+              <w:jc w:val="both"/>
+              <w:cnfStyle w:val="000000000000" w:firstRow="0" w:lastRow="0" w:firstColumn="0" w:lastColumn="0" w:oddVBand="0" w:evenVBand="0" w:oddHBand="0" w:evenHBand="0" w:firstRowFirstColumn="0" w:firstRowLastColumn="0" w:lastRowFirstColumn="0" w:lastRowLastColumn="0"/>
+              <w:rPr>
+                <w:rFonts w:ascii="EB Garamond" w:eastAsia="EB Garamond" w:hAnsi="EB Garamond" w:cs="EB Garamond"/>
+                <w:sz w:val="21"/>
+                <w:szCs w:val="21"/>
+              </w:rPr>
+            </w:pPr>
+            <w:r>
+              <w:rPr>
+                <w:rFonts w:ascii="EB Garamond" w:eastAsia="EB Garamond" w:hAnsi="EB Garamond" w:cs="EB Garamond"/>
+                <w:sz w:val="21"/>
+                <w:szCs w:val="21"/>
+              </w:rPr>
+              <w:t> </w:t>
+            </w:r>
+          </w:p>
+        </w:tc>
+        <w:tc>
+          <w:tcPr>
+            <w:tcW w:w="2835" w:type="dxa"/>
+            <w:tcBorders>
+              <w:top w:val="single" w:sz="8" w:space="0" w:color="7F7F7F"/>
+              <w:left w:val="nil"/>
+              <w:bottom w:val="single" w:sz="8" w:space="0" w:color="7F7F7F"/>
+              <w:right w:val="nil"/>
+            </w:tcBorders>
+            <w:hideMark/>
+          </w:tcPr>
+          <w:p>
+            <w:pPr>
+              <w:pBdr>
+                <w:top w:val="nil"/>
+                <w:left w:val="nil"/>
+                <w:bottom w:val="nil"/>
+                <w:right w:val="nil"/>
+                <w:between w:val="nil"/>
+              </w:pBdr>
+              <w:shd w:val="clear" w:color="auto" w:fill="FFFFFF"/>
+              <w:spacing w:before="60" w:after="60"/>
+              <w:ind w:firstLine="425"/>
+              <w:jc w:val="both"/>
+              <w:cnfStyle w:val="000000000000" w:firstRow="0" w:lastRow="0" w:firstColumn="0" w:lastColumn="0" w:oddVBand="0" w:evenVBand="0" w:oddHBand="0" w:evenHBand="0" w:firstRowFirstColumn="0" w:firstRowLastColumn="0" w:lastRowFirstColumn="0" w:lastRowLastColumn="0"/>
+              <w:rPr>
+                <w:rFonts w:ascii="EB Garamond" w:eastAsia="EB Garamond" w:hAnsi="EB Garamond" w:cs="EB Garamond"/>
+                <w:sz w:val="21"/>
+                <w:szCs w:val="21"/>
+              </w:rPr>
+            </w:pPr>
+            <w:r>
+              <w:rPr>
+                <w:rFonts w:ascii="EB Garamond" w:eastAsia="EB Garamond" w:hAnsi="EB Garamond" w:cs="EB Garamond"/>
+                <w:sz w:val="21"/>
+                <w:szCs w:val="21"/>
+              </w:rPr>
+              <w:t> </w:t>
+            </w:r>
+          </w:p>
+        </w:tc>
+      </w:tr>
+    </w:tbl>
+    <w:p>
+      <w:pPr>
+        <w:pBdr>
+          <w:top w:val="nil"/>
+          <w:left w:val="nil"/>
+          <w:bottom w:val="nil"/>
+          <w:right w:val="nil"/>
+          <w:between w:val="nil"/>
+        </w:pBdr>
+        <w:shd w:val="clear" w:color="auto" w:fill="FFFFFF"/>
+        <w:spacing w:before="60" w:after="60" w:line="240" w:lineRule="auto"/>
+        <w:ind w:firstLine="425"/>
+        <w:jc w:val="both"/>
+        <w:rPr>
+          <w:rFonts w:ascii="EB Garamond" w:eastAsia="EB Garamond" w:hAnsi="EB Garamond" w:cs="EB Garamond"/>
+          <w:sz w:val="21"/>
+          <w:szCs w:val="21"/>
+        </w:rPr>
+      </w:pPr>
+      <w:r>
+        <w:rPr>
+          <w:rFonts w:ascii="EB Garamond" w:eastAsia="EB Garamond" w:hAnsi="EB Garamond" w:cs="EB Garamond"/>
+          <w:sz w:val="21"/>
+          <w:szCs w:val="21"/>
+        </w:rPr>
+        <w:t>Nota: (en caso de ser necesario)</w:t>
+      </w:r>
+    </w:p>
+    <w:p>
+      <w:pPr>
+        <w:pBdr>
+          <w:top w:val="nil"/>
+          <w:left w:val="nil"/>
+          <w:bottom w:val="nil"/>
+          <w:right w:val="nil"/>
+          <w:between w:val="nil"/>
+        </w:pBdr>
+        <w:shd w:val="clear" w:color="auto" w:fill="FFFFFF"/>
+        <w:spacing w:before="60" w:after="60" w:line="240" w:lineRule="auto"/>
+        <w:ind w:firstLine="425"/>
+        <w:jc w:val="both"/>
+        <w:rPr>
+          <w:rFonts w:ascii="EB Garamond" w:eastAsia="EB Garamond" w:hAnsi="EB Garamond" w:cs="EB Garamond"/>
+          <w:sz w:val="21"/>
+          <w:szCs w:val="21"/>
+        </w:rPr>
+      </w:pPr>
     </w:p>
     <w:p>
       <w:pPr>
@@ -965,8 +1766,6 @@
         </w:rPr>
         <w:t>. Editorial.</w:t>
       </w:r>
-      <w:bookmarkStart w:id="1" w:name="_GoBack"/>
-      <w:bookmarkEnd w:id="1"/>
     </w:p>
     <w:p>
       <w:pPr>
@@ -1048,79 +1847,7 @@
           <w:sz w:val="21"/>
           <w:szCs w:val="21"/>
         </w:rPr>
-        <w:t>Apellido Autor, N. N. (año). Título del capítulo o entrada en N. Apellido Editor (Ed.), Título del libro (</w:t>
-      </w:r>
-      <w:proofErr w:type="spellStart"/>
-      <w:r>
-        <w:rPr>
-          <w:rFonts w:ascii="EB Garamond" w:eastAsia="EB Garamond" w:hAnsi="EB Garamond" w:cs="EB Garamond"/>
-          <w:sz w:val="21"/>
-          <w:szCs w:val="21"/>
-        </w:rPr>
-        <w:t>xx</w:t>
-      </w:r>
-      <w:proofErr w:type="spellEnd"/>
-      <w:r>
-        <w:rPr>
-          <w:rFonts w:ascii="EB Garamond" w:eastAsia="EB Garamond" w:hAnsi="EB Garamond" w:cs="EB Garamond"/>
-          <w:sz w:val="21"/>
-          <w:szCs w:val="21"/>
-        </w:rPr>
-        <w:t xml:space="preserve"> ed., Vol. </w:t>
-      </w:r>
-      <w:proofErr w:type="spellStart"/>
-      <w:r>
-        <w:rPr>
-          <w:rFonts w:ascii="EB Garamond" w:eastAsia="EB Garamond" w:hAnsi="EB Garamond" w:cs="EB Garamond"/>
-          <w:sz w:val="21"/>
-          <w:szCs w:val="21"/>
-        </w:rPr>
-        <w:t>xx</w:t>
-      </w:r>
-      <w:proofErr w:type="spellEnd"/>
-      <w:r>
-        <w:rPr>
-          <w:rFonts w:ascii="EB Garamond" w:eastAsia="EB Garamond" w:hAnsi="EB Garamond" w:cs="EB Garamond"/>
-          <w:sz w:val="21"/>
-          <w:szCs w:val="21"/>
-        </w:rPr>
-        <w:t xml:space="preserve">, pp. </w:t>
-      </w:r>
-      <w:proofErr w:type="spellStart"/>
-      <w:r>
-        <w:rPr>
-          <w:rFonts w:ascii="EB Garamond" w:eastAsia="EB Garamond" w:hAnsi="EB Garamond" w:cs="EB Garamond"/>
-          <w:sz w:val="21"/>
-          <w:szCs w:val="21"/>
-        </w:rPr>
-        <w:t>xxx</w:t>
-      </w:r>
-      <w:proofErr w:type="spellEnd"/>
-      <w:r>
-        <w:rPr>
-          <w:rFonts w:ascii="EB Garamond" w:eastAsia="EB Garamond" w:hAnsi="EB Garamond" w:cs="EB Garamond"/>
-          <w:sz w:val="21"/>
-          <w:szCs w:val="21"/>
-        </w:rPr>
-        <w:t>–</w:t>
-      </w:r>
-      <w:proofErr w:type="spellStart"/>
-      <w:r>
-        <w:rPr>
-          <w:rFonts w:ascii="EB Garamond" w:eastAsia="EB Garamond" w:hAnsi="EB Garamond" w:cs="EB Garamond"/>
-          <w:sz w:val="21"/>
-          <w:szCs w:val="21"/>
-        </w:rPr>
-        <w:t>xxx</w:t>
-      </w:r>
-      <w:proofErr w:type="spellEnd"/>
-      <w:r>
-        <w:rPr>
-          <w:rFonts w:ascii="EB Garamond" w:eastAsia="EB Garamond" w:hAnsi="EB Garamond" w:cs="EB Garamond"/>
-          <w:sz w:val="21"/>
-          <w:szCs w:val="21"/>
-        </w:rPr>
-        <w:t>). Editorial.</w:t>
+        <w:t>Apellido Autor, N. N. (año). Título del capítulo o entrada en N. Apellido Editor (Ed.), Título del libro (xx ed., Vol. xx, pp. xxx–xxx). Editorial.</w:t>
       </w:r>
     </w:p>
     <w:p>
@@ -1172,74 +1899,12 @@
           <w:sz w:val="21"/>
           <w:szCs w:val="21"/>
         </w:rPr>
-        <w:t>Apellido, A., Apellido, B. y Apellido, C. (2019). Título del artículo específico. Título de la R</w:t>
-      </w:r>
-      <w:r>
-        <w:rPr>
-          <w:rFonts w:ascii="EB Garamond" w:eastAsia="EB Garamond" w:hAnsi="EB Garamond" w:cs="EB Garamond"/>
-          <w:sz w:val="21"/>
-          <w:szCs w:val="21"/>
-        </w:rPr>
-        <w:t xml:space="preserve">evista, </w:t>
-      </w:r>
-      <w:proofErr w:type="gramStart"/>
-      <w:r>
-        <w:rPr>
-          <w:rFonts w:ascii="EB Garamond" w:eastAsia="EB Garamond" w:hAnsi="EB Garamond" w:cs="EB Garamond"/>
-          <w:sz w:val="21"/>
-          <w:szCs w:val="21"/>
-        </w:rPr>
-        <w:t>Volumen(</w:t>
-      </w:r>
-      <w:proofErr w:type="gramEnd"/>
-      <w:r>
-        <w:rPr>
-          <w:rFonts w:ascii="EB Garamond" w:eastAsia="EB Garamond" w:hAnsi="EB Garamond" w:cs="EB Garamond"/>
-          <w:sz w:val="21"/>
-          <w:szCs w:val="21"/>
-        </w:rPr>
-        <w:t xml:space="preserve">número de la revista), número de página inicio – </w:t>
-      </w:r>
-      <w:proofErr w:type="spellStart"/>
-      <w:r>
-        <w:rPr>
-          <w:rFonts w:ascii="EB Garamond" w:eastAsia="EB Garamond" w:hAnsi="EB Garamond" w:cs="EB Garamond"/>
-          <w:sz w:val="21"/>
-          <w:szCs w:val="21"/>
-        </w:rPr>
-        <w:t>numero</w:t>
-      </w:r>
-      <w:proofErr w:type="spellEnd"/>
-      <w:r>
-        <w:rPr>
-          <w:rFonts w:ascii="EB Garamond" w:eastAsia="EB Garamond" w:hAnsi="EB Garamond" w:cs="EB Garamond"/>
-          <w:sz w:val="21"/>
-          <w:szCs w:val="21"/>
-        </w:rPr>
-        <w:t xml:space="preserve"> de </w:t>
-      </w:r>
-      <w:proofErr w:type="spellStart"/>
-      <w:r>
-        <w:rPr>
-          <w:rFonts w:ascii="EB Garamond" w:eastAsia="EB Garamond" w:hAnsi="EB Garamond" w:cs="EB Garamond"/>
-          <w:sz w:val="21"/>
-          <w:szCs w:val="21"/>
-        </w:rPr>
-        <w:t>pagina</w:t>
-      </w:r>
-      <w:proofErr w:type="spellEnd"/>
-      <w:r>
-        <w:rPr>
-          <w:rFonts w:ascii="EB Garamond" w:eastAsia="EB Garamond" w:hAnsi="EB Garamond" w:cs="EB Garamond"/>
-          <w:sz w:val="21"/>
-          <w:szCs w:val="21"/>
-        </w:rPr>
-        <w:t xml:space="preserve"> fin. https://doi.org/xx.xxxxxxxxxx</w:t>
+        <w:t>Apellido, A., Apellido, B. y Apellido, C. (2019). Título del artículo específico. Título de la Revista, Volumen(número de la revista), número de página inicio – numero de pagina fin. https://doi.org/xx.xxxxxxxxxx</w:t>
       </w:r>
     </w:p>
     <w:sectPr>
-      <w:footerReference w:type="even" r:id="rId7"/>
-      <w:footerReference w:type="default" r:id="rId8"/>
+      <w:footerReference w:type="even" r:id="rId11"/>
+      <w:footerReference w:type="default" r:id="rId12"/>
       <w:pgSz w:w="9639" w:h="13608"/>
       <w:pgMar w:top="1418" w:right="1134" w:bottom="851" w:left="1134" w:header="709" w:footer="709" w:gutter="0"/>
       <w:pgNumType w:start="1"/>
@@ -1250,7 +1915,7 @@
 </file>
 
 <file path=word/endnotes.xml><?xml version="1.0" encoding="utf-8"?>
-<w:endnotes xmlns:wpc="http://schemas.microsoft.com/office/word/2010/wordprocessingCanvas" xmlns:cx="http://schemas.microsoft.com/office/drawing/2014/chartex" xmlns:cx1="http://schemas.microsoft.com/office/drawing/2015/9/8/chartex" xmlns:cx2="http://schemas.microsoft.com/office/drawing/2015/10/21/chartex" xmlns:cx3="http://schemas.microsoft.com/office/drawing/2016/5/9/chartex" xmlns:cx4="http://schemas.microsoft.com/office/drawing/2016/5/10/chartex" xmlns:cx5="http://schemas.microsoft.com/office/drawing/2016/5/11/chartex" xmlns:cx6="http://schemas.microsoft.com/office/drawing/2016/5/12/chartex" xmlns:cx7="http://schemas.microsoft.com/office/drawing/2016/5/13/chartex" xmlns:cx8="http://schemas.microsoft.com/office/drawing/2016/5/14/chartex" xmlns:mc="http://schemas.openxmlformats.org/markup-compatibility/2006" xmlns:aink="http://schemas.microsoft.com/office/drawing/2016/ink" xmlns:am3d="http://schemas.microsoft.com/office/drawing/2017/model3d" xmlns:o="urn:schemas-microsoft-com:office:office" xmlns:r="http://schemas.openxmlformats.org/officeDocument/2006/relationships" xmlns:m="http://schemas.openxmlformats.org/officeDocument/2006/math" xmlns:v="urn:schemas-microsoft-com:vml" xmlns:wp14="http://schemas.microsoft.com/office/word/2010/wordprocessingDrawing" xmlns:wp="http://schemas.openxmlformats.org/drawingml/2006/wordprocessingDrawing" xmlns:w10="urn:schemas-microsoft-com:office:word" xmlns:w="http://schemas.openxmlformats.org/wordprocessingml/2006/main" xmlns:w14="http://schemas.microsoft.com/office/word/2010/wordml" xmlns:w15="http://schemas.microsoft.com/office/word/2012/wordml" xmlns:w16cid="http://schemas.microsoft.com/office/word/2016/wordml/cid" xmlns:w16se="http://schemas.microsoft.com/office/word/2015/wordml/symex" xmlns:wpg="http://schemas.microsoft.com/office/word/2010/wordprocessingGroup" xmlns:wpi="http://schemas.microsoft.com/office/word/2010/wordprocessingInk" xmlns:wne="http://schemas.microsoft.com/office/word/2006/wordml" xmlns:wps="http://schemas.microsoft.com/office/word/2010/wordprocessingShape" mc:Ignorable="w14 w15 w16se w16cid wp14">
+<w:endnotes xmlns:wpc="http://schemas.microsoft.com/office/word/2010/wordprocessingCanvas" xmlns:cx="http://schemas.microsoft.com/office/drawing/2014/chartex" xmlns:cx1="http://schemas.microsoft.com/office/drawing/2015/9/8/chartex" xmlns:mc="http://schemas.openxmlformats.org/markup-compatibility/2006" xmlns:o="urn:schemas-microsoft-com:office:office" xmlns:r="http://schemas.openxmlformats.org/officeDocument/2006/relationships" xmlns:m="http://schemas.openxmlformats.org/officeDocument/2006/math" xmlns:v="urn:schemas-microsoft-com:vml" xmlns:wp14="http://schemas.microsoft.com/office/word/2010/wordprocessingDrawing" xmlns:wp="http://schemas.openxmlformats.org/drawingml/2006/wordprocessingDrawing" xmlns:w10="urn:schemas-microsoft-com:office:word" xmlns:w="http://schemas.openxmlformats.org/wordprocessingml/2006/main" xmlns:w14="http://schemas.microsoft.com/office/word/2010/wordml" xmlns:w15="http://schemas.microsoft.com/office/word/2012/wordml" xmlns:w16se="http://schemas.microsoft.com/office/word/2015/wordml/symex" xmlns:wpg="http://schemas.microsoft.com/office/word/2010/wordprocessingGroup" xmlns:wpi="http://schemas.microsoft.com/office/word/2010/wordprocessingInk" xmlns:wne="http://schemas.microsoft.com/office/word/2006/wordml" xmlns:wps="http://schemas.microsoft.com/office/word/2010/wordprocessingShape" mc:Ignorable="w14 w15 w16se wp14">
   <w:endnote w:type="separator" w:id="-1">
     <w:p>
       <w:pPr>
@@ -1275,7 +1940,7 @@
 </file>
 
 <file path=word/footer1.xml><?xml version="1.0" encoding="utf-8"?>
-<w:ftr xmlns:wpc="http://schemas.microsoft.com/office/word/2010/wordprocessingCanvas" xmlns:cx="http://schemas.microsoft.com/office/drawing/2014/chartex" xmlns:cx1="http://schemas.microsoft.com/office/drawing/2015/9/8/chartex" xmlns:cx2="http://schemas.microsoft.com/office/drawing/2015/10/21/chartex" xmlns:cx3="http://schemas.microsoft.com/office/drawing/2016/5/9/chartex" xmlns:cx4="http://schemas.microsoft.com/office/drawing/2016/5/10/chartex" xmlns:cx5="http://schemas.microsoft.com/office/drawing/2016/5/11/chartex" xmlns:cx6="http://schemas.microsoft.com/office/drawing/2016/5/12/chartex" xmlns:cx7="http://schemas.microsoft.com/office/drawing/2016/5/13/chartex" xmlns:cx8="http://schemas.microsoft.com/office/drawing/2016/5/14/chartex" xmlns:mc="http://schemas.openxmlformats.org/markup-compatibility/2006" xmlns:aink="http://schemas.microsoft.com/office/drawing/2016/ink" xmlns:am3d="http://schemas.microsoft.com/office/drawing/2017/model3d" xmlns:o="urn:schemas-microsoft-com:office:office" xmlns:r="http://schemas.openxmlformats.org/officeDocument/2006/relationships" xmlns:m="http://schemas.openxmlformats.org/officeDocument/2006/math" xmlns:v="urn:schemas-microsoft-com:vml" xmlns:wp14="http://schemas.microsoft.com/office/word/2010/wordprocessingDrawing" xmlns:wp="http://schemas.openxmlformats.org/drawingml/2006/wordprocessingDrawing" xmlns:w10="urn:schemas-microsoft-com:office:word" xmlns:w="http://schemas.openxmlformats.org/wordprocessingml/2006/main" xmlns:w14="http://schemas.microsoft.com/office/word/2010/wordml" xmlns:w15="http://schemas.microsoft.com/office/word/2012/wordml" xmlns:w16cid="http://schemas.microsoft.com/office/word/2016/wordml/cid" xmlns:w16se="http://schemas.microsoft.com/office/word/2015/wordml/symex" xmlns:wpg="http://schemas.microsoft.com/office/word/2010/wordprocessingGroup" xmlns:wpi="http://schemas.microsoft.com/office/word/2010/wordprocessingInk" xmlns:wne="http://schemas.microsoft.com/office/word/2006/wordml" xmlns:wps="http://schemas.microsoft.com/office/word/2010/wordprocessingShape" mc:Ignorable="w14 w15 w16se w16cid wp14">
+<w:ftr xmlns:wpc="http://schemas.microsoft.com/office/word/2010/wordprocessingCanvas" xmlns:cx="http://schemas.microsoft.com/office/drawing/2014/chartex" xmlns:cx1="http://schemas.microsoft.com/office/drawing/2015/9/8/chartex" xmlns:mc="http://schemas.openxmlformats.org/markup-compatibility/2006" xmlns:o="urn:schemas-microsoft-com:office:office" xmlns:r="http://schemas.openxmlformats.org/officeDocument/2006/relationships" xmlns:m="http://schemas.openxmlformats.org/officeDocument/2006/math" xmlns:v="urn:schemas-microsoft-com:vml" xmlns:wp14="http://schemas.microsoft.com/office/word/2010/wordprocessingDrawing" xmlns:wp="http://schemas.openxmlformats.org/drawingml/2006/wordprocessingDrawing" xmlns:w10="urn:schemas-microsoft-com:office:word" xmlns:w="http://schemas.openxmlformats.org/wordprocessingml/2006/main" xmlns:w14="http://schemas.microsoft.com/office/word/2010/wordml" xmlns:w15="http://schemas.microsoft.com/office/word/2012/wordml" xmlns:w16se="http://schemas.microsoft.com/office/word/2015/wordml/symex" xmlns:wpg="http://schemas.microsoft.com/office/word/2010/wordprocessingGroup" xmlns:wpi="http://schemas.microsoft.com/office/word/2010/wordprocessingInk" xmlns:wne="http://schemas.microsoft.com/office/word/2006/wordml" xmlns:wps="http://schemas.microsoft.com/office/word/2010/wordprocessingShape" mc:Ignorable="w14 w15 w16se wp14">
   <w:p>
     <w:pPr>
       <w:pBdr>
@@ -1390,7 +2055,7 @@
 </file>
 
 <file path=word/footer2.xml><?xml version="1.0" encoding="utf-8"?>
-<w:ftr xmlns:wpc="http://schemas.microsoft.com/office/word/2010/wordprocessingCanvas" xmlns:cx="http://schemas.microsoft.com/office/drawing/2014/chartex" xmlns:cx1="http://schemas.microsoft.com/office/drawing/2015/9/8/chartex" xmlns:cx2="http://schemas.microsoft.com/office/drawing/2015/10/21/chartex" xmlns:cx3="http://schemas.microsoft.com/office/drawing/2016/5/9/chartex" xmlns:cx4="http://schemas.microsoft.com/office/drawing/2016/5/10/chartex" xmlns:cx5="http://schemas.microsoft.com/office/drawing/2016/5/11/chartex" xmlns:cx6="http://schemas.microsoft.com/office/drawing/2016/5/12/chartex" xmlns:cx7="http://schemas.microsoft.com/office/drawing/2016/5/13/chartex" xmlns:cx8="http://schemas.microsoft.com/office/drawing/2016/5/14/chartex" xmlns:mc="http://schemas.openxmlformats.org/markup-compatibility/2006" xmlns:aink="http://schemas.microsoft.com/office/drawing/2016/ink" xmlns:am3d="http://schemas.microsoft.com/office/drawing/2017/model3d" xmlns:o="urn:schemas-microsoft-com:office:office" xmlns:r="http://schemas.openxmlformats.org/officeDocument/2006/relationships" xmlns:m="http://schemas.openxmlformats.org/officeDocument/2006/math" xmlns:v="urn:schemas-microsoft-com:vml" xmlns:wp14="http://schemas.microsoft.com/office/word/2010/wordprocessingDrawing" xmlns:wp="http://schemas.openxmlformats.org/drawingml/2006/wordprocessingDrawing" xmlns:w10="urn:schemas-microsoft-com:office:word" xmlns:w="http://schemas.openxmlformats.org/wordprocessingml/2006/main" xmlns:w14="http://schemas.microsoft.com/office/word/2010/wordml" xmlns:w15="http://schemas.microsoft.com/office/word/2012/wordml" xmlns:w16cid="http://schemas.microsoft.com/office/word/2016/wordml/cid" xmlns:w16se="http://schemas.microsoft.com/office/word/2015/wordml/symex" xmlns:wpg="http://schemas.microsoft.com/office/word/2010/wordprocessingGroup" xmlns:wpi="http://schemas.microsoft.com/office/word/2010/wordprocessingInk" xmlns:wne="http://schemas.microsoft.com/office/word/2006/wordml" xmlns:wps="http://schemas.microsoft.com/office/word/2010/wordprocessingShape" mc:Ignorable="w14 w15 w16se w16cid wp14">
+<w:ftr xmlns:wpc="http://schemas.microsoft.com/office/word/2010/wordprocessingCanvas" xmlns:cx="http://schemas.microsoft.com/office/drawing/2014/chartex" xmlns:cx1="http://schemas.microsoft.com/office/drawing/2015/9/8/chartex" xmlns:mc="http://schemas.openxmlformats.org/markup-compatibility/2006" xmlns:o="urn:schemas-microsoft-com:office:office" xmlns:r="http://schemas.openxmlformats.org/officeDocument/2006/relationships" xmlns:m="http://schemas.openxmlformats.org/officeDocument/2006/math" xmlns:v="urn:schemas-microsoft-com:vml" xmlns:wp14="http://schemas.microsoft.com/office/word/2010/wordprocessingDrawing" xmlns:wp="http://schemas.openxmlformats.org/drawingml/2006/wordprocessingDrawing" xmlns:w10="urn:schemas-microsoft-com:office:word" xmlns:w="http://schemas.openxmlformats.org/wordprocessingml/2006/main" xmlns:w14="http://schemas.microsoft.com/office/word/2010/wordml" xmlns:w15="http://schemas.microsoft.com/office/word/2012/wordml" xmlns:w16se="http://schemas.microsoft.com/office/word/2015/wordml/symex" xmlns:wpg="http://schemas.microsoft.com/office/word/2010/wordprocessingGroup" xmlns:wpi="http://schemas.microsoft.com/office/word/2010/wordprocessingInk" xmlns:wne="http://schemas.microsoft.com/office/word/2006/wordml" xmlns:wps="http://schemas.microsoft.com/office/word/2010/wordprocessingShape" mc:Ignorable="w14 w15 w16se wp14">
   <w:p>
     <w:pPr>
       <w:pBdr>
@@ -1505,7 +2170,7 @@
 </file>
 
 <file path=word/footnotes.xml><?xml version="1.0" encoding="utf-8"?>
-<w:footnotes xmlns:wpc="http://schemas.microsoft.com/office/word/2010/wordprocessingCanvas" xmlns:cx="http://schemas.microsoft.com/office/drawing/2014/chartex" xmlns:cx1="http://schemas.microsoft.com/office/drawing/2015/9/8/chartex" xmlns:cx2="http://schemas.microsoft.com/office/drawing/2015/10/21/chartex" xmlns:cx3="http://schemas.microsoft.com/office/drawing/2016/5/9/chartex" xmlns:cx4="http://schemas.microsoft.com/office/drawing/2016/5/10/chartex" xmlns:cx5="http://schemas.microsoft.com/office/drawing/2016/5/11/chartex" xmlns:cx6="http://schemas.microsoft.com/office/drawing/2016/5/12/chartex" xmlns:cx7="http://schemas.microsoft.com/office/drawing/2016/5/13/chartex" xmlns:cx8="http://schemas.microsoft.com/office/drawing/2016/5/14/chartex" xmlns:mc="http://schemas.openxmlformats.org/markup-compatibility/2006" xmlns:aink="http://schemas.microsoft.com/office/drawing/2016/ink" xmlns:am3d="http://schemas.microsoft.com/office/drawing/2017/model3d" xmlns:o="urn:schemas-microsoft-com:office:office" xmlns:r="http://schemas.openxmlformats.org/officeDocument/2006/relationships" xmlns:m="http://schemas.openxmlformats.org/officeDocument/2006/math" xmlns:v="urn:schemas-microsoft-com:vml" xmlns:wp14="http://schemas.microsoft.com/office/word/2010/wordprocessingDrawing" xmlns:wp="http://schemas.openxmlformats.org/drawingml/2006/wordprocessingDrawing" xmlns:w10="urn:schemas-microsoft-com:office:word" xmlns:w="http://schemas.openxmlformats.org/wordprocessingml/2006/main" xmlns:w14="http://schemas.microsoft.com/office/word/2010/wordml" xmlns:w15="http://schemas.microsoft.com/office/word/2012/wordml" xmlns:w16cid="http://schemas.microsoft.com/office/word/2016/wordml/cid" xmlns:w16se="http://schemas.microsoft.com/office/word/2015/wordml/symex" xmlns:wpg="http://schemas.microsoft.com/office/word/2010/wordprocessingGroup" xmlns:wpi="http://schemas.microsoft.com/office/word/2010/wordprocessingInk" xmlns:wne="http://schemas.microsoft.com/office/word/2006/wordml" xmlns:wps="http://schemas.microsoft.com/office/word/2010/wordprocessingShape" mc:Ignorable="w14 w15 w16se w16cid wp14">
+<w:footnotes xmlns:wpc="http://schemas.microsoft.com/office/word/2010/wordprocessingCanvas" xmlns:cx="http://schemas.microsoft.com/office/drawing/2014/chartex" xmlns:cx1="http://schemas.microsoft.com/office/drawing/2015/9/8/chartex" xmlns:mc="http://schemas.openxmlformats.org/markup-compatibility/2006" xmlns:o="urn:schemas-microsoft-com:office:office" xmlns:r="http://schemas.openxmlformats.org/officeDocument/2006/relationships" xmlns:m="http://schemas.openxmlformats.org/officeDocument/2006/math" xmlns:v="urn:schemas-microsoft-com:vml" xmlns:wp14="http://schemas.microsoft.com/office/word/2010/wordprocessingDrawing" xmlns:wp="http://schemas.openxmlformats.org/drawingml/2006/wordprocessingDrawing" xmlns:w10="urn:schemas-microsoft-com:office:word" xmlns:w="http://schemas.openxmlformats.org/wordprocessingml/2006/main" xmlns:w14="http://schemas.microsoft.com/office/word/2010/wordml" xmlns:w15="http://schemas.microsoft.com/office/word/2012/wordml" xmlns:w16se="http://schemas.microsoft.com/office/word/2015/wordml/symex" xmlns:wpg="http://schemas.microsoft.com/office/word/2010/wordprocessingGroup" xmlns:wpi="http://schemas.microsoft.com/office/word/2010/wordprocessingInk" xmlns:wne="http://schemas.microsoft.com/office/word/2006/wordml" xmlns:wps="http://schemas.microsoft.com/office/word/2010/wordprocessingShape" mc:Ignorable="w14 w15 w16se wp14">
   <w:footnote w:type="separator" w:id="-1">
     <w:p>
       <w:pPr>
@@ -1530,7 +2195,7 @@
 </file>
 
 <file path=word/styles.xml><?xml version="1.0" encoding="utf-8"?>
-<w:styles xmlns:mc="http://schemas.openxmlformats.org/markup-compatibility/2006" xmlns:r="http://schemas.openxmlformats.org/officeDocument/2006/relationships" xmlns:w="http://schemas.openxmlformats.org/wordprocessingml/2006/main" xmlns:w14="http://schemas.microsoft.com/office/word/2010/wordml" xmlns:w15="http://schemas.microsoft.com/office/word/2012/wordml" xmlns:w16cid="http://schemas.microsoft.com/office/word/2016/wordml/cid" xmlns:w16se="http://schemas.microsoft.com/office/word/2015/wordml/symex" mc:Ignorable="w14 w15 w16se w16cid">
+<w:styles xmlns:mc="http://schemas.openxmlformats.org/markup-compatibility/2006" xmlns:r="http://schemas.openxmlformats.org/officeDocument/2006/relationships" xmlns:w="http://schemas.openxmlformats.org/wordprocessingml/2006/main" xmlns:w14="http://schemas.microsoft.com/office/word/2010/wordml" xmlns:w15="http://schemas.microsoft.com/office/word/2012/wordml" xmlns:w16se="http://schemas.microsoft.com/office/word/2015/wordml/symex" mc:Ignorable="w14 w15 w16se">
   <w:docDefaults>
     <w:rPrDefault>
       <w:rPr>
@@ -1546,7 +2211,7 @@
       </w:pPr>
     </w:pPrDefault>
   </w:docDefaults>
-  <w:latentStyles w:defLockedState="0" w:defUIPriority="99" w:defSemiHidden="0" w:defUnhideWhenUsed="0" w:defQFormat="0" w:count="375">
+  <w:latentStyles w:defLockedState="0" w:defUIPriority="99" w:defSemiHidden="0" w:defUnhideWhenUsed="0" w:defQFormat="0" w:count="371">
     <w:lsdException w:name="Normal" w:uiPriority="0" w:qFormat="1"/>
     <w:lsdException w:name="heading 1" w:uiPriority="9" w:qFormat="1"/>
     <w:lsdException w:name="heading 2" w:semiHidden="1" w:uiPriority="9" w:unhideWhenUsed="1" w:qFormat="1"/>
@@ -1918,10 +2583,6 @@
     <w:lsdException w:name="List Table 5 Dark Accent 6" w:uiPriority="50"/>
     <w:lsdException w:name="List Table 6 Colorful Accent 6" w:uiPriority="51"/>
     <w:lsdException w:name="List Table 7 Colorful Accent 6" w:uiPriority="52"/>
-    <w:lsdException w:name="Mention" w:semiHidden="1" w:unhideWhenUsed="1"/>
-    <w:lsdException w:name="Smart Hyperlink" w:semiHidden="1" w:unhideWhenUsed="1"/>
-    <w:lsdException w:name="Hashtag" w:semiHidden="1" w:unhideWhenUsed="1"/>
-    <w:lsdException w:name="Unresolved Mention" w:semiHidden="1" w:unhideWhenUsed="1"/>
   </w:latentStyles>
   <w:style w:type="paragraph" w:default="1" w:styleId="Normal">
     <w:name w:val="Normal"/>
@@ -2046,7 +2707,6 @@
   <w:style w:type="character" w:default="1" w:styleId="Fuentedeprrafopredeter">
     <w:name w:val="Default Paragraph Font"/>
     <w:uiPriority w:val="1"/>
-    <w:semiHidden/>
     <w:unhideWhenUsed/>
   </w:style>
   <w:style w:type="table" w:default="1" w:styleId="Tablanormal">
@@ -2320,6 +2980,97 @@
       <w:color w:val="666666"/>
       <w:sz w:val="48"/>
       <w:szCs w:val="48"/>
+    </w:rPr>
+  </w:style>
+  <w:style w:type="table" w:styleId="Tablanormal2">
+    <w:name w:val="Plain Table 2"/>
+    <w:basedOn w:val="Tablanormal"/>
+    <w:uiPriority w:val="42"/>
+    <w:rsid w:val="00CD29B8"/>
+    <w:pPr>
+      <w:spacing w:after="0" w:line="240" w:lineRule="auto"/>
+    </w:pPr>
+    <w:tblPr>
+      <w:tblStyleRowBandSize w:val="1"/>
+      <w:tblStyleColBandSize w:val="1"/>
+      <w:tblBorders>
+        <w:top w:val="single" w:sz="4" w:space="0" w:color="7F7F7F" w:themeColor="text1" w:themeTint="80"/>
+        <w:bottom w:val="single" w:sz="4" w:space="0" w:color="7F7F7F" w:themeColor="text1" w:themeTint="80"/>
+      </w:tblBorders>
+    </w:tblPr>
+    <w:tblStylePr w:type="firstRow">
+      <w:rPr>
+        <w:b/>
+        <w:bCs/>
+      </w:rPr>
+      <w:tblPr/>
+      <w:tcPr>
+        <w:tcBorders>
+          <w:bottom w:val="single" w:sz="4" w:space="0" w:color="7F7F7F" w:themeColor="text1" w:themeTint="80"/>
+        </w:tcBorders>
+      </w:tcPr>
+    </w:tblStylePr>
+    <w:tblStylePr w:type="lastRow">
+      <w:rPr>
+        <w:b/>
+        <w:bCs/>
+      </w:rPr>
+      <w:tblPr/>
+      <w:tcPr>
+        <w:tcBorders>
+          <w:top w:val="single" w:sz="4" w:space="0" w:color="7F7F7F" w:themeColor="text1" w:themeTint="80"/>
+        </w:tcBorders>
+      </w:tcPr>
+    </w:tblStylePr>
+    <w:tblStylePr w:type="firstCol">
+      <w:rPr>
+        <w:b/>
+        <w:bCs/>
+      </w:rPr>
+    </w:tblStylePr>
+    <w:tblStylePr w:type="lastCol">
+      <w:rPr>
+        <w:b/>
+        <w:bCs/>
+      </w:rPr>
+    </w:tblStylePr>
+    <w:tblStylePr w:type="band1Vert">
+      <w:tblPr/>
+      <w:tcPr>
+        <w:tcBorders>
+          <w:left w:val="single" w:sz="4" w:space="0" w:color="7F7F7F" w:themeColor="text1" w:themeTint="80"/>
+          <w:right w:val="single" w:sz="4" w:space="0" w:color="7F7F7F" w:themeColor="text1" w:themeTint="80"/>
+        </w:tcBorders>
+      </w:tcPr>
+    </w:tblStylePr>
+    <w:tblStylePr w:type="band2Vert">
+      <w:tblPr/>
+      <w:tcPr>
+        <w:tcBorders>
+          <w:left w:val="single" w:sz="4" w:space="0" w:color="7F7F7F" w:themeColor="text1" w:themeTint="80"/>
+          <w:right w:val="single" w:sz="4" w:space="0" w:color="7F7F7F" w:themeColor="text1" w:themeTint="80"/>
+        </w:tcBorders>
+      </w:tcPr>
+    </w:tblStylePr>
+    <w:tblStylePr w:type="band1Horz">
+      <w:tblPr/>
+      <w:tcPr>
+        <w:tcBorders>
+          <w:top w:val="single" w:sz="4" w:space="0" w:color="7F7F7F" w:themeColor="text1" w:themeTint="80"/>
+          <w:bottom w:val="single" w:sz="4" w:space="0" w:color="7F7F7F" w:themeColor="text1" w:themeTint="80"/>
+        </w:tcBorders>
+      </w:tcPr>
+    </w:tblStylePr>
+  </w:style>
+  <w:style w:type="character" w:styleId="Hipervnculo">
+    <w:name w:val="Hyperlink"/>
+    <w:basedOn w:val="Fuentedeprrafopredeter"/>
+    <w:uiPriority w:val="99"/>
+    <w:unhideWhenUsed/>
+    <w:rsid w:val="008914EF"/>
+    <w:rPr>
+      <w:color w:val="0563C1" w:themeColor="hyperlink"/>
+      <w:u w:val="single"/>
     </w:rPr>
   </w:style>
 </w:styles>

</xml_diff>